<commit_message>
Prepare Booking confirmation scenario review
</commit_message>
<xml_diff>
--- a/supabase/templates/booking-information/Booking_Information_Carbone_Template.docx
+++ b/supabase/templates/booking-information/Booking_Information_Carbone_Template.docx
@@ -7,7 +7,7 @@
         <w:pStyle w:val="Title"/>
       </w:pPr>
       <w:r>
-        <w:t>Booking information</w:t>
+        <w:t>Booking confirmation</w:t>
       </w:r>
     </w:p>
     <w:p>
@@ -24,6 +24,17 @@
       </w:r>
       <w:r>
         <w:t>{d.bookingConfirmation.bookingReference}</w:t>
+      </w:r>
+    </w:p>
+    <w:p>
+      <w:r>
+        <w:rPr>
+          <w:b/>
+        </w:rPr>
+        <w:t xml:space="preserve">Direction  </w:t>
+      </w:r>
+      <w:r>
+        <w:t>{d.bookingConfirmation.direction}</w:t>
       </w:r>
     </w:p>
     <w:p>
@@ -62,6 +73,86 @@
     <w:p>
       <w:r>
         <w:t>This document records only the transport services shown below and the information available when this version was prepared.</w:t>
+      </w:r>
+    </w:p>
+    <w:p>
+      <w:r>
+        <w:t>{d.bookingConfirmation.shipper.name:ifNEM():showBegin}</w:t>
+      </w:r>
+    </w:p>
+    <w:p>
+      <w:pPr>
+        <w:pStyle w:val="Heading1"/>
+      </w:pPr>
+      <w:r>
+        <w:t>Shipper</w:t>
+      </w:r>
+    </w:p>
+    <w:p>
+      <w:r>
+        <w:rPr>
+          <w:b/>
+        </w:rPr>
+        <w:t xml:space="preserve">Name  </w:t>
+      </w:r>
+      <w:r>
+        <w:t>{d.bookingConfirmation.shipper.name}</w:t>
+      </w:r>
+    </w:p>
+    <w:p>
+      <w:r>
+        <w:rPr>
+          <w:b/>
+        </w:rPr>
+        <w:t xml:space="preserve">Address  </w:t>
+      </w:r>
+      <w:r>
+        <w:t>{d.bookingConfirmation.shipper.address}</w:t>
+      </w:r>
+    </w:p>
+    <w:p>
+      <w:r>
+        <w:t>{d.bookingConfirmation.shipper.name:showEnd}</w:t>
+      </w:r>
+    </w:p>
+    <w:p>
+      <w:r>
+        <w:t>{d.bookingConfirmation.consignee.name:ifNEM():showBegin}</w:t>
+      </w:r>
+    </w:p>
+    <w:p>
+      <w:pPr>
+        <w:pStyle w:val="Heading1"/>
+      </w:pPr>
+      <w:r>
+        <w:t>Consignee</w:t>
+      </w:r>
+    </w:p>
+    <w:p>
+      <w:r>
+        <w:rPr>
+          <w:b/>
+        </w:rPr>
+        <w:t xml:space="preserve">Name  </w:t>
+      </w:r>
+      <w:r>
+        <w:t>{d.bookingConfirmation.consignee.name}</w:t>
+      </w:r>
+    </w:p>
+    <w:p>
+      <w:r>
+        <w:rPr>
+          <w:b/>
+        </w:rPr>
+        <w:t xml:space="preserve">Address  </w:t>
+      </w:r>
+      <w:r>
+        <w:t>{d.bookingConfirmation.consignee.address}</w:t>
+      </w:r>
+    </w:p>
+    <w:p>
+      <w:r>
+        <w:t>{d.bookingConfirmation.consignee.name:showEnd}</w:t>
       </w:r>
     </w:p>
     <w:p>
@@ -1106,7 +1197,7 @@
       <w:jc w:val="center"/>
     </w:pPr>
     <w:r>
-      <w:t>Booking information · {d.bookingConfirmation.bookingReference}</w:t>
+      <w:t>Booking confirmation · {d.bookingConfirmation.bookingReference}</w:t>
     </w:r>
   </w:p>
 </w:ftr>

</xml_diff>

<commit_message>
Keep Booking confirmation tables within A4 margins
</commit_message>
<xml_diff>
--- a/supabase/templates/booking-information/Booking_Information_Carbone_Template.docx
+++ b/supabase/templates/booking-information/Booking_Information_Carbone_Template.docx
@@ -223,14 +223,15 @@
       <w:tblPr>
         <w:tblStyle w:val="TableGrid"/>
         <w:tblW w:type="auto" w:w="0"/>
+        <w:tblLayout w:type="fixed"/>
         <w:tblLook w:firstColumn="1" w:firstRow="1" w:lastColumn="0" w:lastRow="0" w:noHBand="0" w:noVBand="1" w:val="04A0"/>
       </w:tblPr>
       <w:tblGrid>
-        <w:gridCol w:w="1966"/>
-        <w:gridCol w:w="1966"/>
-        <w:gridCol w:w="1966"/>
-        <w:gridCol w:w="1966"/>
-        <w:gridCol w:w="1966"/>
+        <w:gridCol w:w="964"/>
+        <w:gridCol w:w="1984"/>
+        <w:gridCol w:w="1984"/>
+        <w:gridCol w:w="2438"/>
+        <w:gridCol w:w="2438"/>
       </w:tblGrid>
       <w:tr>
         <w:trPr>
@@ -238,7 +239,7 @@
         </w:trPr>
         <w:tc>
           <w:tcPr>
-            <w:tcW w:type="dxa" w:w="1966"/>
+            <w:tcW w:type="dxa" w:w="964"/>
             <w:vAlign w:val="center"/>
           </w:tcPr>
           <w:p>
@@ -256,7 +257,7 @@
         </w:tc>
         <w:tc>
           <w:tcPr>
-            <w:tcW w:type="dxa" w:w="1966"/>
+            <w:tcW w:type="dxa" w:w="1984"/>
             <w:vAlign w:val="center"/>
           </w:tcPr>
           <w:p>
@@ -274,7 +275,7 @@
         </w:tc>
         <w:tc>
           <w:tcPr>
-            <w:tcW w:type="dxa" w:w="1966"/>
+            <w:tcW w:type="dxa" w:w="1984"/>
             <w:vAlign w:val="center"/>
           </w:tcPr>
           <w:p>
@@ -292,7 +293,7 @@
         </w:tc>
         <w:tc>
           <w:tcPr>
-            <w:tcW w:type="dxa" w:w="1966"/>
+            <w:tcW w:type="dxa" w:w="2438"/>
             <w:vAlign w:val="center"/>
           </w:tcPr>
           <w:p>
@@ -310,7 +311,7 @@
         </w:tc>
         <w:tc>
           <w:tcPr>
-            <w:tcW w:type="dxa" w:w="1966"/>
+            <w:tcW w:type="dxa" w:w="2438"/>
             <w:vAlign w:val="center"/>
           </w:tcPr>
           <w:p>
@@ -330,7 +331,7 @@
       <w:tr>
         <w:tc>
           <w:tcPr>
-            <w:tcW w:type="dxa" w:w="1966"/>
+            <w:tcW w:type="dxa" w:w="964"/>
             <w:vAlign w:val="center"/>
           </w:tcPr>
           <w:p>
@@ -347,7 +348,7 @@
         </w:tc>
         <w:tc>
           <w:tcPr>
-            <w:tcW w:type="dxa" w:w="1966"/>
+            <w:tcW w:type="dxa" w:w="1984"/>
             <w:vAlign w:val="center"/>
           </w:tcPr>
           <w:p>
@@ -364,7 +365,7 @@
         </w:tc>
         <w:tc>
           <w:tcPr>
-            <w:tcW w:type="dxa" w:w="1966"/>
+            <w:tcW w:type="dxa" w:w="1984"/>
             <w:vAlign w:val="center"/>
           </w:tcPr>
           <w:p>
@@ -381,7 +382,7 @@
         </w:tc>
         <w:tc>
           <w:tcPr>
-            <w:tcW w:type="dxa" w:w="1966"/>
+            <w:tcW w:type="dxa" w:w="2438"/>
             <w:vAlign w:val="center"/>
           </w:tcPr>
           <w:p>
@@ -398,7 +399,7 @@
         </w:tc>
         <w:tc>
           <w:tcPr>
-            <w:tcW w:type="dxa" w:w="1966"/>
+            <w:tcW w:type="dxa" w:w="2438"/>
             <w:vAlign w:val="center"/>
           </w:tcPr>
           <w:p>
@@ -417,7 +418,7 @@
       <w:tr>
         <w:tc>
           <w:tcPr>
-            <w:tcW w:type="dxa" w:w="1966"/>
+            <w:tcW w:type="dxa" w:w="964"/>
           </w:tcPr>
           <w:p>
             <w:pPr>
@@ -433,7 +434,7 @@
         </w:tc>
         <w:tc>
           <w:tcPr>
-            <w:tcW w:type="dxa" w:w="1966"/>
+            <w:tcW w:type="dxa" w:w="1984"/>
           </w:tcPr>
           <w:p>
             <w:pPr>
@@ -448,7 +449,7 @@
         </w:tc>
         <w:tc>
           <w:tcPr>
-            <w:tcW w:type="dxa" w:w="1966"/>
+            <w:tcW w:type="dxa" w:w="1984"/>
           </w:tcPr>
           <w:p>
             <w:pPr>
@@ -463,7 +464,7 @@
         </w:tc>
         <w:tc>
           <w:tcPr>
-            <w:tcW w:type="dxa" w:w="1966"/>
+            <w:tcW w:type="dxa" w:w="2438"/>
           </w:tcPr>
           <w:p>
             <w:pPr>
@@ -478,7 +479,7 @@
         </w:tc>
         <w:tc>
           <w:tcPr>
-            <w:tcW w:type="dxa" w:w="1966"/>
+            <w:tcW w:type="dxa" w:w="2438"/>
           </w:tcPr>
           <w:p>
             <w:pPr>
@@ -566,14 +567,15 @@
       <w:tblPr>
         <w:tblStyle w:val="TableGrid"/>
         <w:tblW w:type="auto" w:w="0"/>
+        <w:tblLayout w:type="fixed"/>
         <w:tblLook w:firstColumn="1" w:firstRow="1" w:lastColumn="0" w:lastRow="0" w:noHBand="0" w:noVBand="1" w:val="04A0"/>
       </w:tblPr>
       <w:tblGrid>
-        <w:gridCol w:w="1966"/>
-        <w:gridCol w:w="1966"/>
-        <w:gridCol w:w="1966"/>
-        <w:gridCol w:w="1966"/>
-        <w:gridCol w:w="1966"/>
+        <w:gridCol w:w="2665"/>
+        <w:gridCol w:w="2211"/>
+        <w:gridCol w:w="1134"/>
+        <w:gridCol w:w="1304"/>
+        <w:gridCol w:w="2494"/>
       </w:tblGrid>
       <w:tr>
         <w:trPr>
@@ -581,7 +583,7 @@
         </w:trPr>
         <w:tc>
           <w:tcPr>
-            <w:tcW w:type="dxa" w:w="1966"/>
+            <w:tcW w:type="dxa" w:w="2665"/>
             <w:vAlign w:val="center"/>
           </w:tcPr>
           <w:p>
@@ -599,7 +601,7 @@
         </w:tc>
         <w:tc>
           <w:tcPr>
-            <w:tcW w:type="dxa" w:w="1966"/>
+            <w:tcW w:type="dxa" w:w="2211"/>
             <w:vAlign w:val="center"/>
           </w:tcPr>
           <w:p>
@@ -617,7 +619,7 @@
         </w:tc>
         <w:tc>
           <w:tcPr>
-            <w:tcW w:type="dxa" w:w="1966"/>
+            <w:tcW w:type="dxa" w:w="1134"/>
             <w:vAlign w:val="center"/>
           </w:tcPr>
           <w:p>
@@ -635,7 +637,7 @@
         </w:tc>
         <w:tc>
           <w:tcPr>
-            <w:tcW w:type="dxa" w:w="1966"/>
+            <w:tcW w:type="dxa" w:w="1304"/>
             <w:vAlign w:val="center"/>
           </w:tcPr>
           <w:p>
@@ -653,7 +655,7 @@
         </w:tc>
         <w:tc>
           <w:tcPr>
-            <w:tcW w:type="dxa" w:w="1966"/>
+            <w:tcW w:type="dxa" w:w="2494"/>
             <w:vAlign w:val="center"/>
           </w:tcPr>
           <w:p>
@@ -673,7 +675,7 @@
       <w:tr>
         <w:tc>
           <w:tcPr>
-            <w:tcW w:type="dxa" w:w="1966"/>
+            <w:tcW w:type="dxa" w:w="2665"/>
             <w:vAlign w:val="center"/>
           </w:tcPr>
           <w:p>
@@ -690,7 +692,7 @@
         </w:tc>
         <w:tc>
           <w:tcPr>
-            <w:tcW w:type="dxa" w:w="1966"/>
+            <w:tcW w:type="dxa" w:w="2211"/>
             <w:vAlign w:val="center"/>
           </w:tcPr>
           <w:p>
@@ -707,7 +709,7 @@
         </w:tc>
         <w:tc>
           <w:tcPr>
-            <w:tcW w:type="dxa" w:w="1966"/>
+            <w:tcW w:type="dxa" w:w="1134"/>
             <w:vAlign w:val="center"/>
           </w:tcPr>
           <w:p>
@@ -724,7 +726,7 @@
         </w:tc>
         <w:tc>
           <w:tcPr>
-            <w:tcW w:type="dxa" w:w="1966"/>
+            <w:tcW w:type="dxa" w:w="1304"/>
             <w:vAlign w:val="center"/>
           </w:tcPr>
           <w:p>
@@ -741,7 +743,7 @@
         </w:tc>
         <w:tc>
           <w:tcPr>
-            <w:tcW w:type="dxa" w:w="1966"/>
+            <w:tcW w:type="dxa" w:w="2494"/>
             <w:vAlign w:val="center"/>
           </w:tcPr>
           <w:p>
@@ -760,7 +762,7 @@
       <w:tr>
         <w:tc>
           <w:tcPr>
-            <w:tcW w:type="dxa" w:w="1966"/>
+            <w:tcW w:type="dxa" w:w="2665"/>
           </w:tcPr>
           <w:p>
             <w:pPr>
@@ -776,7 +778,7 @@
         </w:tc>
         <w:tc>
           <w:tcPr>
-            <w:tcW w:type="dxa" w:w="1966"/>
+            <w:tcW w:type="dxa" w:w="2211"/>
           </w:tcPr>
           <w:p>
             <w:pPr>
@@ -791,7 +793,7 @@
         </w:tc>
         <w:tc>
           <w:tcPr>
-            <w:tcW w:type="dxa" w:w="1966"/>
+            <w:tcW w:type="dxa" w:w="1134"/>
           </w:tcPr>
           <w:p>
             <w:pPr>
@@ -806,7 +808,7 @@
         </w:tc>
         <w:tc>
           <w:tcPr>
-            <w:tcW w:type="dxa" w:w="1966"/>
+            <w:tcW w:type="dxa" w:w="1304"/>
           </w:tcPr>
           <w:p>
             <w:pPr>
@@ -821,7 +823,7 @@
         </w:tc>
         <w:tc>
           <w:tcPr>
-            <w:tcW w:type="dxa" w:w="1966"/>
+            <w:tcW w:type="dxa" w:w="2494"/>
           </w:tcPr>
           <w:p>
             <w:pPr>
@@ -874,12 +876,13 @@
       <w:tblPr>
         <w:tblStyle w:val="TableGrid"/>
         <w:tblW w:type="auto" w:w="0"/>
+        <w:tblLayout w:type="fixed"/>
         <w:tblLook w:firstColumn="1" w:firstRow="1" w:lastColumn="0" w:lastRow="0" w:noHBand="0" w:noVBand="1" w:val="04A0"/>
       </w:tblPr>
       <w:tblGrid>
-        <w:gridCol w:w="3277"/>
-        <w:gridCol w:w="3277"/>
-        <w:gridCol w:w="3277"/>
+        <w:gridCol w:w="5669"/>
+        <w:gridCol w:w="1701"/>
+        <w:gridCol w:w="2438"/>
       </w:tblGrid>
       <w:tr>
         <w:trPr>
@@ -887,7 +890,7 @@
         </w:trPr>
         <w:tc>
           <w:tcPr>
-            <w:tcW w:type="dxa" w:w="3277"/>
+            <w:tcW w:type="dxa" w:w="5669"/>
             <w:vAlign w:val="center"/>
           </w:tcPr>
           <w:p>
@@ -905,7 +908,7 @@
         </w:tc>
         <w:tc>
           <w:tcPr>
-            <w:tcW w:type="dxa" w:w="3277"/>
+            <w:tcW w:type="dxa" w:w="1701"/>
             <w:vAlign w:val="center"/>
           </w:tcPr>
           <w:p>
@@ -923,7 +926,7 @@
         </w:tc>
         <w:tc>
           <w:tcPr>
-            <w:tcW w:type="dxa" w:w="3277"/>
+            <w:tcW w:type="dxa" w:w="2438"/>
             <w:vAlign w:val="center"/>
           </w:tcPr>
           <w:p>
@@ -943,7 +946,7 @@
       <w:tr>
         <w:tc>
           <w:tcPr>
-            <w:tcW w:type="dxa" w:w="3277"/>
+            <w:tcW w:type="dxa" w:w="5669"/>
             <w:vAlign w:val="center"/>
           </w:tcPr>
           <w:p>
@@ -960,7 +963,7 @@
         </w:tc>
         <w:tc>
           <w:tcPr>
-            <w:tcW w:type="dxa" w:w="3277"/>
+            <w:tcW w:type="dxa" w:w="1701"/>
             <w:vAlign w:val="center"/>
           </w:tcPr>
           <w:p>
@@ -977,7 +980,7 @@
         </w:tc>
         <w:tc>
           <w:tcPr>
-            <w:tcW w:type="dxa" w:w="3277"/>
+            <w:tcW w:type="dxa" w:w="2438"/>
             <w:vAlign w:val="center"/>
           </w:tcPr>
           <w:p>
@@ -996,7 +999,7 @@
       <w:tr>
         <w:tc>
           <w:tcPr>
-            <w:tcW w:type="dxa" w:w="3277"/>
+            <w:tcW w:type="dxa" w:w="5669"/>
           </w:tcPr>
           <w:p>
             <w:pPr>
@@ -1012,7 +1015,7 @@
         </w:tc>
         <w:tc>
           <w:tcPr>
-            <w:tcW w:type="dxa" w:w="3277"/>
+            <w:tcW w:type="dxa" w:w="1701"/>
           </w:tcPr>
           <w:p>
             <w:pPr>
@@ -1027,7 +1030,7 @@
         </w:tc>
         <w:tc>
           <w:tcPr>
-            <w:tcW w:type="dxa" w:w="3277"/>
+            <w:tcW w:type="dxa" w:w="2438"/>
           </w:tcPr>
           <w:p>
             <w:pPr>
@@ -1051,11 +1054,12 @@
       <w:tblPr>
         <w:tblStyle w:val="TableGrid"/>
         <w:tblW w:type="auto" w:w="0"/>
+        <w:tblLayout w:type="fixed"/>
         <w:tblLook w:firstColumn="1" w:firstRow="1" w:lastColumn="0" w:lastRow="0" w:noHBand="0" w:noVBand="1" w:val="04A0"/>
       </w:tblPr>
       <w:tblGrid>
-        <w:gridCol w:w="4916"/>
-        <w:gridCol w:w="4916"/>
+        <w:gridCol w:w="4932"/>
+        <w:gridCol w:w="4876"/>
       </w:tblGrid>
       <w:tr>
         <w:trPr>
@@ -1063,7 +1067,7 @@
         </w:trPr>
         <w:tc>
           <w:tcPr>
-            <w:tcW w:type="dxa" w:w="4916"/>
+            <w:tcW w:type="dxa" w:w="4932"/>
             <w:vAlign w:val="center"/>
           </w:tcPr>
           <w:p>
@@ -1081,7 +1085,7 @@
         </w:tc>
         <w:tc>
           <w:tcPr>
-            <w:tcW w:type="dxa" w:w="4916"/>
+            <w:tcW w:type="dxa" w:w="4876"/>
             <w:vAlign w:val="center"/>
           </w:tcPr>
           <w:p>
@@ -1101,7 +1105,7 @@
       <w:tr>
         <w:tc>
           <w:tcPr>
-            <w:tcW w:type="dxa" w:w="4916"/>
+            <w:tcW w:type="dxa" w:w="4932"/>
             <w:vAlign w:val="center"/>
           </w:tcPr>
           <w:p>
@@ -1118,7 +1122,7 @@
         </w:tc>
         <w:tc>
           <w:tcPr>
-            <w:tcW w:type="dxa" w:w="4916"/>
+            <w:tcW w:type="dxa" w:w="4876"/>
             <w:vAlign w:val="center"/>
           </w:tcPr>
           <w:p>
@@ -1137,7 +1141,7 @@
       <w:tr>
         <w:tc>
           <w:tcPr>
-            <w:tcW w:type="dxa" w:w="4916"/>
+            <w:tcW w:type="dxa" w:w="4932"/>
           </w:tcPr>
           <w:p>
             <w:pPr>
@@ -1153,7 +1157,7 @@
         </w:tc>
         <w:tc>
           <w:tcPr>
-            <w:tcW w:type="dxa" w:w="4916"/>
+            <w:tcW w:type="dxa" w:w="4876"/>
           </w:tcPr>
           <w:p>
             <w:pPr>

</xml_diff>

<commit_message>
Shorten Booking template table tags for Word layout
</commit_message>
<xml_diff>
--- a/supabase/templates/booking-information/Booking_Information_Carbone_Template.docx
+++ b/supabase/templates/booking-information/Booking_Information_Carbone_Template.docx
@@ -213,6 +213,26 @@
     </w:p>
     <w:p>
       <w:pPr>
+        <w:spacing w:after="40"/>
+      </w:pPr>
+      <w:r>
+        <w:t>{#t=d.bookingConfirmation.mainTransport}</w:t>
+      </w:r>
+      <w:r>
+        <w:t>{#origin=d.bookingConfirmation.mainTransport[i].origin}</w:t>
+      </w:r>
+      <w:r>
+        <w:t>{#destination=d.bookingConfirmation.mainTransport[i].destination}</w:t>
+      </w:r>
+      <w:r>
+        <w:t>{#departure=d.bookingConfirmation.mainTransport[i].plannedDepartureAt:formatD('DD MMM YYYY HH:mm')}</w:t>
+      </w:r>
+      <w:r>
+        <w:t>{#arrival=d.bookingConfirmation.mainTransport[i].plannedArrivalAt:formatD('DD MMM YYYY HH:mm')}</w:t>
+      </w:r>
+    </w:p>
+    <w:p>
+      <w:pPr>
         <w:pStyle w:val="Heading1"/>
       </w:pPr>
       <w:r>
@@ -227,11 +247,11 @@
         <w:tblLook w:firstColumn="1" w:firstRow="1" w:lastColumn="0" w:lastRow="0" w:noHBand="0" w:noVBand="1" w:val="04A0"/>
       </w:tblPr>
       <w:tblGrid>
-        <w:gridCol w:w="964"/>
-        <w:gridCol w:w="1984"/>
-        <w:gridCol w:w="1984"/>
-        <w:gridCol w:w="2438"/>
-        <w:gridCol w:w="2438"/>
+        <w:gridCol w:w="1247"/>
+        <w:gridCol w:w="1928"/>
+        <w:gridCol w:w="1928"/>
+        <w:gridCol w:w="2324"/>
+        <w:gridCol w:w="2381"/>
       </w:tblGrid>
       <w:tr>
         <w:trPr>
@@ -239,7 +259,7 @@
         </w:trPr>
         <w:tc>
           <w:tcPr>
-            <w:tcW w:type="dxa" w:w="964"/>
+            <w:tcW w:type="dxa" w:w="1247"/>
             <w:vAlign w:val="center"/>
           </w:tcPr>
           <w:p>
@@ -257,7 +277,7 @@
         </w:tc>
         <w:tc>
           <w:tcPr>
-            <w:tcW w:type="dxa" w:w="1984"/>
+            <w:tcW w:type="dxa" w:w="1928"/>
             <w:vAlign w:val="center"/>
           </w:tcPr>
           <w:p>
@@ -275,7 +295,7 @@
         </w:tc>
         <w:tc>
           <w:tcPr>
-            <w:tcW w:type="dxa" w:w="1984"/>
+            <w:tcW w:type="dxa" w:w="1928"/>
             <w:vAlign w:val="center"/>
           </w:tcPr>
           <w:p>
@@ -293,7 +313,7 @@
         </w:tc>
         <w:tc>
           <w:tcPr>
-            <w:tcW w:type="dxa" w:w="2438"/>
+            <w:tcW w:type="dxa" w:w="2324"/>
             <w:vAlign w:val="center"/>
           </w:tcPr>
           <w:p>
@@ -311,7 +331,7 @@
         </w:tc>
         <w:tc>
           <w:tcPr>
-            <w:tcW w:type="dxa" w:w="2438"/>
+            <w:tcW w:type="dxa" w:w="2381"/>
             <w:vAlign w:val="center"/>
           </w:tcPr>
           <w:p>
@@ -331,7 +351,7 @@
       <w:tr>
         <w:tc>
           <w:tcPr>
-            <w:tcW w:type="dxa" w:w="964"/>
+            <w:tcW w:type="dxa" w:w="1247"/>
             <w:vAlign w:val="center"/>
           </w:tcPr>
           <w:p>
@@ -342,13 +362,13 @@
               <w:rPr>
                 <w:sz w:val="16"/>
               </w:rPr>
-              <w:t>{d.bookingConfirmation.mainTransport[i].mode}</w:t>
+              <w:t>{$t[i].mode}</w:t>
             </w:r>
           </w:p>
         </w:tc>
         <w:tc>
           <w:tcPr>
-            <w:tcW w:type="dxa" w:w="1984"/>
+            <w:tcW w:type="dxa" w:w="1928"/>
             <w:vAlign w:val="center"/>
           </w:tcPr>
           <w:p>
@@ -359,13 +379,13 @@
               <w:rPr>
                 <w:sz w:val="16"/>
               </w:rPr>
-              <w:t>{d.bookingConfirmation.mainTransport[i].origin}</w:t>
+              <w:t>{$origin}</w:t>
             </w:r>
           </w:p>
         </w:tc>
         <w:tc>
           <w:tcPr>
-            <w:tcW w:type="dxa" w:w="1984"/>
+            <w:tcW w:type="dxa" w:w="1928"/>
             <w:vAlign w:val="center"/>
           </w:tcPr>
           <w:p>
@@ -376,13 +396,13 @@
               <w:rPr>
                 <w:sz w:val="16"/>
               </w:rPr>
-              <w:t>{d.bookingConfirmation.mainTransport[i].destination}</w:t>
+              <w:t>{$destination}</w:t>
             </w:r>
           </w:p>
         </w:tc>
         <w:tc>
           <w:tcPr>
-            <w:tcW w:type="dxa" w:w="2438"/>
+            <w:tcW w:type="dxa" w:w="2324"/>
             <w:vAlign w:val="center"/>
           </w:tcPr>
           <w:p>
@@ -393,13 +413,13 @@
               <w:rPr>
                 <w:sz w:val="16"/>
               </w:rPr>
-              <w:t>{d.bookingConfirmation.mainTransport[i].plannedDepartureAt:formatD('DD MMM YYYY HH:mm')}</w:t>
+              <w:t>{$departure}</w:t>
             </w:r>
           </w:p>
         </w:tc>
         <w:tc>
           <w:tcPr>
-            <w:tcW w:type="dxa" w:w="2438"/>
+            <w:tcW w:type="dxa" w:w="2381"/>
             <w:vAlign w:val="center"/>
           </w:tcPr>
           <w:p>
@@ -410,7 +430,7 @@
               <w:rPr>
                 <w:sz w:val="16"/>
               </w:rPr>
-              <w:t>{d.bookingConfirmation.mainTransport[i].plannedArrivalAt:formatD('DD MMM YYYY HH:mm')}</w:t>
+              <w:t>{$arrival}</w:t>
             </w:r>
           </w:p>
         </w:tc>
@@ -418,7 +438,7 @@
       <w:tr>
         <w:tc>
           <w:tcPr>
-            <w:tcW w:type="dxa" w:w="964"/>
+            <w:tcW w:type="dxa" w:w="1247"/>
           </w:tcPr>
           <w:p>
             <w:pPr>
@@ -428,13 +448,13 @@
               <w:rPr>
                 <w:sz w:val="16"/>
               </w:rPr>
-              <w:t>{d.bookingConfirmation.mainTransport[i+1]}</w:t>
+              <w:t>{$t[i+1]}</w:t>
             </w:r>
           </w:p>
         </w:tc>
         <w:tc>
           <w:tcPr>
-            <w:tcW w:type="dxa" w:w="1984"/>
+            <w:tcW w:type="dxa" w:w="1928"/>
           </w:tcPr>
           <w:p>
             <w:pPr>
@@ -449,7 +469,7 @@
         </w:tc>
         <w:tc>
           <w:tcPr>
-            <w:tcW w:type="dxa" w:w="1984"/>
+            <w:tcW w:type="dxa" w:w="1928"/>
           </w:tcPr>
           <w:p>
             <w:pPr>
@@ -464,7 +484,7 @@
         </w:tc>
         <w:tc>
           <w:tcPr>
-            <w:tcW w:type="dxa" w:w="2438"/>
+            <w:tcW w:type="dxa" w:w="2324"/>
           </w:tcPr>
           <w:p>
             <w:pPr>
@@ -479,7 +499,7 @@
         </w:tc>
         <w:tc>
           <w:tcPr>
-            <w:tcW w:type="dxa" w:w="2438"/>
+            <w:tcW w:type="dxa" w:w="2381"/>
           </w:tcPr>
           <w:p>
             <w:pPr>
@@ -553,6 +573,26 @@
     <w:p>
       <w:r>
         <w:t>{d.bookingConfirmation.scope.delivery:showEnd}</w:t>
+      </w:r>
+    </w:p>
+    <w:p>
+      <w:pPr>
+        <w:spacing w:after="40"/>
+      </w:pPr>
+      <w:r>
+        <w:t>{#g=d.bookingConfirmation.cargo}</w:t>
+      </w:r>
+      <w:r>
+        <w:t>{#marks=d.bookingConfirmation.cargo[i].marksAndNumbers}</w:t>
+      </w:r>
+      <w:r>
+        <w:t>{#packages=d.bookingConfirmation.cargo[i].packages}</w:t>
+      </w:r>
+      <w:r>
+        <w:t>{#packageType=d.bookingConfirmation.cargo[i].packageType}</w:t>
+      </w:r>
+      <w:r>
+        <w:t>{#weight=d.bookingConfirmation.cargo[i].grossWeightKg}</w:t>
       </w:r>
     </w:p>
     <w:p>
@@ -686,7 +726,7 @@
               <w:rPr>
                 <w:sz w:val="16"/>
               </w:rPr>
-              <w:t>{d.bookingConfirmation.cargo[i].description}</w:t>
+              <w:t>{$g[i].description}</w:t>
             </w:r>
           </w:p>
         </w:tc>
@@ -703,7 +743,7 @@
               <w:rPr>
                 <w:sz w:val="16"/>
               </w:rPr>
-              <w:t>{d.bookingConfirmation.cargo[i].marksAndNumbers}</w:t>
+              <w:t>{$marks}</w:t>
             </w:r>
           </w:p>
         </w:tc>
@@ -720,7 +760,7 @@
               <w:rPr>
                 <w:sz w:val="16"/>
               </w:rPr>
-              <w:t>{d.bookingConfirmation.cargo[i].packages}</w:t>
+              <w:t>{$packages}</w:t>
             </w:r>
           </w:p>
         </w:tc>
@@ -737,7 +777,7 @@
               <w:rPr>
                 <w:sz w:val="16"/>
               </w:rPr>
-              <w:t>{d.bookingConfirmation.cargo[i].packageType}</w:t>
+              <w:t>{$packageType}</w:t>
             </w:r>
           </w:p>
         </w:tc>
@@ -754,7 +794,7 @@
               <w:rPr>
                 <w:sz w:val="16"/>
               </w:rPr>
-              <w:t>{d.bookingConfirmation.cargo[i].grossWeightKg}</w:t>
+              <w:t>{$weight}</w:t>
             </w:r>
           </w:p>
         </w:tc>
@@ -772,7 +812,7 @@
               <w:rPr>
                 <w:sz w:val="16"/>
               </w:rPr>
-              <w:t>{d.bookingConfirmation.cargo[i+1]}</w:t>
+              <w:t>{$g[i+1]}</w:t>
             </w:r>
           </w:p>
         </w:tc>

</xml_diff>

<commit_message>
Checkpoint local Quote Booking Customs and document work before dev sync
</commit_message>
<xml_diff>
--- a/supabase/templates/booking-information/Booking_Information_Carbone_Template.docx
+++ b/supabase/templates/booking-information/Booking_Information_Carbone_Template.docx
@@ -4,254 +4,799 @@
   <w:body>
     <w:p>
       <w:pPr>
-        <w:pStyle w:val="Title"/>
+        <w:spacing w:line="24" w:lineRule="auto"/>
       </w:pPr>
       <w:r>
-        <w:t>Booking confirmation</w:t>
+        <w:rPr>
+          <w:sz w:val="2"/>
+        </w:rPr>
+        <w:t>{#ref=d.bookingConfirmation.bookingReference}</w:t>
+      </w:r>
+      <w:r>
+        <w:rPr>
+          <w:sz w:val="2"/>
+        </w:rPr>
+        <w:t>{#direction=d.bookingConfirmation.direction}</w:t>
+      </w:r>
+      <w:r>
+        <w:rPr>
+          <w:sz w:val="2"/>
+        </w:rPr>
+        <w:t>{#mode=d.bookingConfirmation.mode}</w:t>
+      </w:r>
+      <w:r>
+        <w:rPr>
+          <w:sz w:val="2"/>
+        </w:rPr>
+        <w:t>{#shipmentType=d.bookingConfirmation.shipmentType}</w:t>
+      </w:r>
+      <w:r>
+        <w:rPr>
+          <w:sz w:val="2"/>
+        </w:rPr>
+        <w:t>{#incoterm=d.bookingConfirmation.incoterm}</w:t>
+      </w:r>
+      <w:r>
+        <w:rPr>
+          <w:sz w:val="2"/>
+        </w:rPr>
+        <w:t>{#customer=d.customer.name}</w:t>
+      </w:r>
+      <w:r>
+        <w:rPr>
+          <w:sz w:val="2"/>
+        </w:rPr>
+        <w:t>{#customerRef=d.bookingConfirmation.customerReference}</w:t>
+      </w:r>
+      <w:r>
+        <w:rPr>
+          <w:sz w:val="2"/>
+        </w:rPr>
+        <w:t>{#shipper=d.bookingConfirmation.shipper.name}</w:t>
+      </w:r>
+      <w:r>
+        <w:rPr>
+          <w:sz w:val="2"/>
+        </w:rPr>
+        <w:t>{#shipperAddress=d.bookingConfirmation.shipper.address}</w:t>
+      </w:r>
+      <w:r>
+        <w:rPr>
+          <w:sz w:val="2"/>
+        </w:rPr>
+        <w:t>{#consignee=d.bookingConfirmation.consignee.name}</w:t>
+      </w:r>
+      <w:r>
+        <w:rPr>
+          <w:sz w:val="2"/>
+        </w:rPr>
+        <w:t>{#consigneeAddress=d.bookingConfirmation.consignee.address}</w:t>
+      </w:r>
+      <w:r>
+        <w:rPr>
+          <w:sz w:val="2"/>
+        </w:rPr>
+        <w:t>{#collectionAddress=d.bookingConfirmation.collection.address}</w:t>
+      </w:r>
+      <w:r>
+        <w:rPr>
+          <w:sz w:val="2"/>
+        </w:rPr>
+        <w:t>{#collectionDate=d.bookingConfirmation.collection.plannedAtLabel}</w:t>
+      </w:r>
+      <w:r>
+        <w:rPr>
+          <w:sz w:val="2"/>
+        </w:rPr>
+        <w:t>{#collectionRemarks=d.bookingConfirmation.collection.remarks}</w:t>
+      </w:r>
+      <w:r>
+        <w:rPr>
+          <w:sz w:val="2"/>
+        </w:rPr>
+        <w:t>{#deliveryAddress=d.bookingConfirmation.delivery.address}</w:t>
+      </w:r>
+      <w:r>
+        <w:rPr>
+          <w:sz w:val="2"/>
+        </w:rPr>
+        <w:t>{#deliveryDate=d.bookingConfirmation.delivery.plannedAtLabel}</w:t>
+      </w:r>
+      <w:r>
+        <w:rPr>
+          <w:sz w:val="2"/>
+        </w:rPr>
+        <w:t>{#deliveryRemarks=d.bookingConfirmation.delivery.remarks}</w:t>
+      </w:r>
+      <w:r>
+        <w:rPr>
+          <w:sz w:val="2"/>
+        </w:rPr>
+        <w:t>{#preparedBy=d.bookingConfirmation.preparedBy}</w:t>
+      </w:r>
+      <w:r>
+        <w:rPr>
+          <w:sz w:val="2"/>
+        </w:rPr>
+        <w:t>{#instructions=d.bookingConfirmation.specialInstructions}</w:t>
       </w:r>
     </w:p>
+    <w:tbl>
+      <w:tblPr>
+        <w:tblW w:type="auto" w:w="0"/>
+        <w:tblLayout w:type="fixed"/>
+        <w:tblLook w:firstColumn="1" w:firstRow="1" w:lastColumn="0" w:lastRow="0" w:noHBand="0" w:noVBand="1" w:val="04A0"/>
+      </w:tblPr>
+      <w:tblGrid>
+        <w:gridCol w:w="6520"/>
+        <w:gridCol w:w="3685"/>
+      </w:tblGrid>
+      <w:tr>
+        <w:tc>
+          <w:tcPr>
+            <w:tcW w:type="dxa" w:w="6520"/>
+          </w:tcPr>
+          <w:p>
+            <w:r/>
+            <w:r>
+              <w:rPr>
+                <w:rFonts w:ascii="Arial" w:hAnsi="Arial"/>
+                <w:b/>
+                <w:color w:val="264860"/>
+                <w:sz w:val="46"/>
+              </w:rPr>
+              <w:t>JENKAR</w:t>
+            </w:r>
+          </w:p>
+        </w:tc>
+        <w:tc>
+          <w:tcPr>
+            <w:tcW w:type="dxa" w:w="3685"/>
+          </w:tcPr>
+          <w:p>
+            <w:pPr>
+              <w:jc w:val="right"/>
+            </w:pPr>
+            <w:r/>
+            <w:r>
+              <w:rPr>
+                <w:b/>
+                <w:sz w:val="16"/>
+              </w:rPr>
+              <w:t>Jenkar Shipping Limited</w:t>
+            </w:r>
+          </w:p>
+        </w:tc>
+      </w:tr>
+    </w:tbl>
     <w:p>
-      <w:r>
-        <w:t>{d.bookingConfirmation.provisional:ifEQ(true):show('Provisional—not confirmed'):elseShow('')}</w:t>
-      </w:r>
-    </w:p>
-    <w:p>
+      <w:pPr>
+        <w:spacing w:before="60" w:after="80"/>
+        <w:jc w:val="center"/>
+      </w:pPr>
       <w:r>
         <w:rPr>
           <w:b/>
+          <w:sz w:val="22"/>
         </w:rPr>
-        <w:t xml:space="preserve">Booking reference  </w:t>
-      </w:r>
-      <w:r>
-        <w:t>{d.bookingConfirmation.bookingReference}</w:t>
-      </w:r>
-    </w:p>
-    <w:p>
-      <w:r>
-        <w:rPr>
-          <w:b/>
-        </w:rPr>
-        <w:t xml:space="preserve">Direction  </w:t>
-      </w:r>
-      <w:r>
-        <w:t>{d.bookingConfirmation.direction}</w:t>
-      </w:r>
-    </w:p>
-    <w:p>
-      <w:r>
-        <w:rPr>
-          <w:b/>
-        </w:rPr>
-        <w:t xml:space="preserve">Customer  </w:t>
-      </w:r>
-      <w:r>
-        <w:t>{d.customer.name}</w:t>
-      </w:r>
-    </w:p>
-    <w:p>
-      <w:r>
-        <w:rPr>
-          <w:b/>
-        </w:rPr>
-        <w:t xml:space="preserve">Customer reference  </w:t>
-      </w:r>
-      <w:r>
-        <w:t>{d.bookingConfirmation.customerReference}</w:t>
-      </w:r>
-    </w:p>
-    <w:p>
-      <w:r>
-        <w:rPr>
-          <w:b/>
-        </w:rPr>
-        <w:t xml:space="preserve">Prepared by  </w:t>
-      </w:r>
-      <w:r>
-        <w:t>{d.bookingConfirmation.preparedBy}</w:t>
-      </w:r>
-    </w:p>
-    <w:p>
-      <w:r>
-        <w:t>This document records only the transport services shown below and the information available when this version was prepared.</w:t>
-      </w:r>
-    </w:p>
-    <w:p>
-      <w:r>
-        <w:t>{d.bookingConfirmation.shipper.name:ifNEM():showBegin}</w:t>
+        <w:t>Booking Confirmation  ·  Our Ref: {$ref}</w:t>
       </w:r>
     </w:p>
     <w:p>
       <w:pPr>
-        <w:pStyle w:val="Heading1"/>
+        <w:spacing w:line="24" w:lineRule="auto"/>
       </w:pPr>
       <w:r>
-        <w:t>Shipper</w:t>
-      </w:r>
-    </w:p>
-    <w:p>
-      <w:r>
         <w:rPr>
-          <w:b/>
+          <w:sz w:val="2"/>
         </w:rPr>
-        <w:t xml:space="preserve">Name  </w:t>
-      </w:r>
-      <w:r>
-        <w:t>{d.bookingConfirmation.shipper.name}</w:t>
-      </w:r>
-    </w:p>
-    <w:p>
-      <w:r>
-        <w:rPr>
-          <w:b/>
-        </w:rPr>
-        <w:t xml:space="preserve">Address  </w:t>
-      </w:r>
-      <w:r>
-        <w:t>{d.bookingConfirmation.shipper.address}</w:t>
-      </w:r>
-    </w:p>
-    <w:p>
-      <w:r>
-        <w:t>{d.bookingConfirmation.shipper.name:showEnd}</w:t>
-      </w:r>
-    </w:p>
-    <w:p>
-      <w:r>
-        <w:t>{d.bookingConfirmation.consignee.name:ifNEM():showBegin}</w:t>
+        <w:t>{d.bookingConfirmation.provisional:ifEQ(true):showBegin}</w:t>
       </w:r>
     </w:p>
     <w:p>
       <w:pPr>
-        <w:pStyle w:val="Heading1"/>
+        <w:jc w:val="center"/>
       </w:pPr>
-      <w:r>
-        <w:t>Consignee</w:t>
-      </w:r>
-    </w:p>
-    <w:p>
       <w:r>
         <w:rPr>
           <w:b/>
+          <w:sz w:val="14"/>
         </w:rPr>
-        <w:t xml:space="preserve">Name  </w:t>
-      </w:r>
-      <w:r>
-        <w:t>{d.bookingConfirmation.consignee.name}</w:t>
-      </w:r>
-    </w:p>
-    <w:p>
-      <w:r>
-        <w:rPr>
-          <w:b/>
-        </w:rPr>
-        <w:t xml:space="preserve">Address  </w:t>
-      </w:r>
-      <w:r>
-        <w:t>{d.bookingConfirmation.consignee.address}</w:t>
-      </w:r>
-    </w:p>
-    <w:p>
-      <w:r>
-        <w:t>{d.bookingConfirmation.consignee.name:showEnd}</w:t>
-      </w:r>
-    </w:p>
-    <w:p>
-      <w:r>
-        <w:t>{d.bookingConfirmation.scope.collection:ifEQ(true):showBegin}</w:t>
+        <w:t>PROVISIONAL BOOKING — NOT YET CONFIRMED</w:t>
       </w:r>
     </w:p>
     <w:p>
       <w:pPr>
-        <w:pStyle w:val="Heading1"/>
+        <w:spacing w:line="24" w:lineRule="auto"/>
       </w:pPr>
       <w:r>
-        <w:t>Collection</w:t>
+        <w:rPr>
+          <w:sz w:val="2"/>
+        </w:rPr>
+        <w:t>{d.bookingConfirmation.provisional:showEnd}</w:t>
       </w:r>
     </w:p>
     <w:p>
+      <w:pPr>
+        <w:spacing w:after="140"/>
+      </w:pPr>
+      <w:r>
+        <w:t>{d.bookingConfirmation.provisional:ifEQ(true):show('Please review the provisional transport arrangements below.'):elseShow('This confirms the transport arrangements shown below.')} Please check the details and tell us promptly if anything needs correcting.</w:t>
+      </w:r>
+    </w:p>
+    <w:tbl>
+      <w:tblPr>
+        <w:tblW w:type="auto" w:w="0"/>
+        <w:tblLayout w:type="fixed"/>
+        <w:tblLook w:firstColumn="1" w:firstRow="1" w:lastColumn="0" w:lastRow="0" w:noHBand="0" w:noVBand="1" w:val="04A0"/>
+      </w:tblPr>
+      <w:tblGrid>
+        <w:gridCol w:w="5102"/>
+        <w:gridCol w:w="5102"/>
+      </w:tblGrid>
+      <w:tr>
+        <w:tc>
+          <w:tcPr>
+            <w:tcW w:type="dxa" w:w="5102"/>
+            <w:vAlign w:val="center"/>
+            <w:tcBorders>
+              <w:top w:val="single" w:sz="4" w:color="7E8D97"/>
+              <w:left w:val="single" w:sz="4" w:color="7E8D97"/>
+              <w:bottom w:val="single" w:sz="4" w:color="7E8D97"/>
+              <w:right w:val="single" w:sz="4" w:color="7E8D97"/>
+            </w:tcBorders>
+            <w:tcMar>
+              <w:top w:w="55" w:type="dxa"/>
+              <w:bottom w:w="55" w:type="dxa"/>
+              <w:start w:w="85" w:type="dxa"/>
+              <w:end w:w="85" w:type="dxa"/>
+            </w:tcMar>
+          </w:tcPr>
+          <w:p>
+            <w:r/>
+            <w:r>
+              <w:rPr>
+                <w:b/>
+                <w:color w:val="264860"/>
+                <w:sz w:val="12"/>
+              </w:rPr>
+              <w:t>SHIPPER</w:t>
+            </w:r>
+            <w:r>
+              <w:rPr>
+                <w:sz w:val="14"/>
+              </w:rPr>
+              <w:br/>
+              <w:t>{$shipper}</w:t>
+              <w:br/>
+              <w:t>{$shipperAddress}</w:t>
+            </w:r>
+          </w:p>
+        </w:tc>
+        <w:tc>
+          <w:tcPr>
+            <w:tcW w:type="dxa" w:w="5102"/>
+            <w:vAlign w:val="center"/>
+            <w:tcBorders>
+              <w:top w:val="single" w:sz="4" w:color="7E8D97"/>
+              <w:left w:val="single" w:sz="4" w:color="7E8D97"/>
+              <w:bottom w:val="single" w:sz="4" w:color="7E8D97"/>
+              <w:right w:val="single" w:sz="4" w:color="7E8D97"/>
+            </w:tcBorders>
+            <w:tcMar>
+              <w:top w:w="55" w:type="dxa"/>
+              <w:bottom w:w="55" w:type="dxa"/>
+              <w:start w:w="85" w:type="dxa"/>
+              <w:end w:w="85" w:type="dxa"/>
+            </w:tcMar>
+          </w:tcPr>
+          <w:p>
+            <w:r/>
+            <w:r>
+              <w:rPr>
+                <w:b/>
+                <w:color w:val="264860"/>
+                <w:sz w:val="12"/>
+              </w:rPr>
+              <w:t>PICK UP FROM</w:t>
+            </w:r>
+            <w:r>
+              <w:rPr>
+                <w:sz w:val="14"/>
+              </w:rPr>
+              <w:br/>
+              <w:t>{$collectionAddress}</w:t>
+              <w:br/>
+              <w:t>{$collectionDate}</w:t>
+            </w:r>
+          </w:p>
+        </w:tc>
+      </w:tr>
+      <w:tr>
+        <w:tc>
+          <w:tcPr>
+            <w:tcW w:type="dxa" w:w="5102"/>
+            <w:vAlign w:val="center"/>
+            <w:tcBorders>
+              <w:top w:val="single" w:sz="4" w:color="7E8D97"/>
+              <w:left w:val="single" w:sz="4" w:color="7E8D97"/>
+              <w:bottom w:val="single" w:sz="4" w:color="7E8D97"/>
+              <w:right w:val="single" w:sz="4" w:color="7E8D97"/>
+            </w:tcBorders>
+            <w:tcMar>
+              <w:top w:w="55" w:type="dxa"/>
+              <w:bottom w:w="55" w:type="dxa"/>
+              <w:start w:w="85" w:type="dxa"/>
+              <w:end w:w="85" w:type="dxa"/>
+            </w:tcMar>
+          </w:tcPr>
+          <w:p>
+            <w:r/>
+            <w:r>
+              <w:rPr>
+                <w:b/>
+                <w:color w:val="264860"/>
+                <w:sz w:val="12"/>
+              </w:rPr>
+              <w:t>CONSIGNEE</w:t>
+            </w:r>
+            <w:r>
+              <w:rPr>
+                <w:sz w:val="14"/>
+              </w:rPr>
+              <w:br/>
+              <w:t>{$consignee}</w:t>
+              <w:br/>
+              <w:t>{$consigneeAddress}</w:t>
+            </w:r>
+          </w:p>
+        </w:tc>
+        <w:tc>
+          <w:tcPr>
+            <w:tcW w:type="dxa" w:w="5102"/>
+            <w:vAlign w:val="center"/>
+            <w:tcBorders>
+              <w:top w:val="single" w:sz="4" w:color="7E8D97"/>
+              <w:left w:val="single" w:sz="4" w:color="7E8D97"/>
+              <w:bottom w:val="single" w:sz="4" w:color="7E8D97"/>
+              <w:right w:val="single" w:sz="4" w:color="7E8D97"/>
+            </w:tcBorders>
+            <w:tcMar>
+              <w:top w:w="55" w:type="dxa"/>
+              <w:bottom w:w="55" w:type="dxa"/>
+              <w:start w:w="85" w:type="dxa"/>
+              <w:end w:w="85" w:type="dxa"/>
+            </w:tcMar>
+          </w:tcPr>
+          <w:p>
+            <w:r/>
+            <w:r>
+              <w:rPr>
+                <w:b/>
+                <w:color w:val="264860"/>
+                <w:sz w:val="12"/>
+              </w:rPr>
+              <w:t>CUSTOMER</w:t>
+            </w:r>
+            <w:r>
+              <w:rPr>
+                <w:sz w:val="14"/>
+              </w:rPr>
+              <w:br/>
+              <w:t>{$customer}</w:t>
+              <w:br/>
+              <w:t>Reference: {$customerRef}</w:t>
+            </w:r>
+          </w:p>
+        </w:tc>
+      </w:tr>
+    </w:tbl>
+    <w:p>
+      <w:pPr>
+        <w:spacing w:before="120" w:after="40"/>
+      </w:pPr>
       <w:r>
         <w:rPr>
           <w:b/>
+          <w:color w:val="264860"/>
+          <w:sz w:val="14"/>
         </w:rPr>
-        <w:t xml:space="preserve">Collection address  </w:t>
-      </w:r>
-      <w:r>
-        <w:t>{d.bookingConfirmation.collection.address}</w:t>
+        <w:t>BOOKING INFORMATION</w:t>
       </w:r>
     </w:p>
+    <w:tbl>
+      <w:tblPr>
+        <w:tblW w:type="auto" w:w="0"/>
+        <w:tblLayout w:type="fixed"/>
+        <w:tblLook w:firstColumn="1" w:firstRow="1" w:lastColumn="0" w:lastRow="0" w:noHBand="0" w:noVBand="1" w:val="04A0"/>
+      </w:tblPr>
+      <w:tblGrid>
+        <w:gridCol w:w="2551"/>
+        <w:gridCol w:w="2551"/>
+        <w:gridCol w:w="2551"/>
+        <w:gridCol w:w="2551"/>
+      </w:tblGrid>
+      <w:tr>
+        <w:tc>
+          <w:tcPr>
+            <w:tcW w:type="dxa" w:w="2551"/>
+            <w:vAlign w:val="center"/>
+            <w:tcBorders>
+              <w:top w:val="single" w:sz="4" w:color="7E8D97"/>
+              <w:left w:val="single" w:sz="4" w:color="7E8D97"/>
+              <w:bottom w:val="single" w:sz="4" w:color="7E8D97"/>
+              <w:right w:val="single" w:sz="4" w:color="7E8D97"/>
+            </w:tcBorders>
+            <w:tcMar>
+              <w:top w:w="55" w:type="dxa"/>
+              <w:bottom w:w="55" w:type="dxa"/>
+              <w:start w:w="85" w:type="dxa"/>
+              <w:end w:w="85" w:type="dxa"/>
+            </w:tcMar>
+          </w:tcPr>
+          <w:p>
+            <w:r/>
+            <w:r>
+              <w:rPr>
+                <w:b/>
+                <w:color w:val="264860"/>
+                <w:sz w:val="12"/>
+              </w:rPr>
+              <w:t>BOOKING REFERENCE</w:t>
+            </w:r>
+            <w:r>
+              <w:rPr>
+                <w:sz w:val="14"/>
+              </w:rPr>
+              <w:br/>
+              <w:t>{$ref}</w:t>
+            </w:r>
+          </w:p>
+        </w:tc>
+        <w:tc>
+          <w:tcPr>
+            <w:tcW w:type="dxa" w:w="2551"/>
+            <w:vAlign w:val="center"/>
+            <w:tcBorders>
+              <w:top w:val="single" w:sz="4" w:color="7E8D97"/>
+              <w:left w:val="single" w:sz="4" w:color="7E8D97"/>
+              <w:bottom w:val="single" w:sz="4" w:color="7E8D97"/>
+              <w:right w:val="single" w:sz="4" w:color="7E8D97"/>
+            </w:tcBorders>
+            <w:tcMar>
+              <w:top w:w="55" w:type="dxa"/>
+              <w:bottom w:w="55" w:type="dxa"/>
+              <w:start w:w="85" w:type="dxa"/>
+              <w:end w:w="85" w:type="dxa"/>
+            </w:tcMar>
+          </w:tcPr>
+          <w:p>
+            <w:r/>
+            <w:r>
+              <w:rPr>
+                <w:b/>
+                <w:color w:val="264860"/>
+                <w:sz w:val="12"/>
+              </w:rPr>
+              <w:t>DIRECTION</w:t>
+            </w:r>
+            <w:r>
+              <w:rPr>
+                <w:sz w:val="14"/>
+              </w:rPr>
+              <w:br/>
+              <w:t>{$direction}</w:t>
+            </w:r>
+          </w:p>
+        </w:tc>
+        <w:tc>
+          <w:tcPr>
+            <w:tcW w:type="dxa" w:w="2551"/>
+            <w:vAlign w:val="center"/>
+            <w:tcBorders>
+              <w:top w:val="single" w:sz="4" w:color="7E8D97"/>
+              <w:left w:val="single" w:sz="4" w:color="7E8D97"/>
+              <w:bottom w:val="single" w:sz="4" w:color="7E8D97"/>
+              <w:right w:val="single" w:sz="4" w:color="7E8D97"/>
+            </w:tcBorders>
+            <w:tcMar>
+              <w:top w:w="55" w:type="dxa"/>
+              <w:bottom w:w="55" w:type="dxa"/>
+              <w:start w:w="85" w:type="dxa"/>
+              <w:end w:w="85" w:type="dxa"/>
+            </w:tcMar>
+          </w:tcPr>
+          <w:p>
+            <w:r/>
+            <w:r>
+              <w:rPr>
+                <w:b/>
+                <w:color w:val="264860"/>
+                <w:sz w:val="12"/>
+              </w:rPr>
+              <w:t>MODE</w:t>
+            </w:r>
+            <w:r>
+              <w:rPr>
+                <w:sz w:val="14"/>
+              </w:rPr>
+              <w:br/>
+              <w:t>{$mode}</w:t>
+            </w:r>
+          </w:p>
+        </w:tc>
+        <w:tc>
+          <w:tcPr>
+            <w:tcW w:type="dxa" w:w="2551"/>
+            <w:vAlign w:val="center"/>
+            <w:tcBorders>
+              <w:top w:val="single" w:sz="4" w:color="7E8D97"/>
+              <w:left w:val="single" w:sz="4" w:color="7E8D97"/>
+              <w:bottom w:val="single" w:sz="4" w:color="7E8D97"/>
+              <w:right w:val="single" w:sz="4" w:color="7E8D97"/>
+            </w:tcBorders>
+            <w:tcMar>
+              <w:top w:w="55" w:type="dxa"/>
+              <w:bottom w:w="55" w:type="dxa"/>
+              <w:start w:w="85" w:type="dxa"/>
+              <w:end w:w="85" w:type="dxa"/>
+            </w:tcMar>
+          </w:tcPr>
+          <w:p>
+            <w:r/>
+            <w:r>
+              <w:rPr>
+                <w:b/>
+                <w:color w:val="264860"/>
+                <w:sz w:val="12"/>
+              </w:rPr>
+              <w:t>SHIPMENT TYPE</w:t>
+            </w:r>
+            <w:r>
+              <w:rPr>
+                <w:sz w:val="14"/>
+              </w:rPr>
+              <w:br/>
+              <w:t>{$shipmentType}</w:t>
+            </w:r>
+          </w:p>
+        </w:tc>
+      </w:tr>
+      <w:tr>
+        <w:tc>
+          <w:tcPr>
+            <w:tcW w:type="dxa" w:w="2551"/>
+            <w:vAlign w:val="center"/>
+            <w:tcBorders>
+              <w:top w:val="single" w:sz="4" w:color="7E8D97"/>
+              <w:left w:val="single" w:sz="4" w:color="7E8D97"/>
+              <w:bottom w:val="single" w:sz="4" w:color="7E8D97"/>
+              <w:right w:val="single" w:sz="4" w:color="7E8D97"/>
+            </w:tcBorders>
+            <w:tcMar>
+              <w:top w:w="55" w:type="dxa"/>
+              <w:bottom w:w="55" w:type="dxa"/>
+              <w:start w:w="85" w:type="dxa"/>
+              <w:end w:w="85" w:type="dxa"/>
+            </w:tcMar>
+          </w:tcPr>
+          <w:p>
+            <w:r/>
+            <w:r>
+              <w:rPr>
+                <w:b/>
+                <w:color w:val="264860"/>
+                <w:sz w:val="12"/>
+              </w:rPr>
+              <w:t>CUSTOMER REFERENCE</w:t>
+            </w:r>
+            <w:r>
+              <w:rPr>
+                <w:sz w:val="14"/>
+              </w:rPr>
+              <w:br/>
+              <w:t>{$customerRef}</w:t>
+            </w:r>
+          </w:p>
+        </w:tc>
+        <w:tc>
+          <w:tcPr>
+            <w:tcW w:type="dxa" w:w="2551"/>
+            <w:vAlign w:val="center"/>
+            <w:tcBorders>
+              <w:top w:val="single" w:sz="4" w:color="7E8D97"/>
+              <w:left w:val="single" w:sz="4" w:color="7E8D97"/>
+              <w:bottom w:val="single" w:sz="4" w:color="7E8D97"/>
+              <w:right w:val="single" w:sz="4" w:color="7E8D97"/>
+            </w:tcBorders>
+            <w:tcMar>
+              <w:top w:w="55" w:type="dxa"/>
+              <w:bottom w:w="55" w:type="dxa"/>
+              <w:start w:w="85" w:type="dxa"/>
+              <w:end w:w="85" w:type="dxa"/>
+            </w:tcMar>
+          </w:tcPr>
+          <w:p>
+            <w:r/>
+            <w:r>
+              <w:rPr>
+                <w:b/>
+                <w:color w:val="264860"/>
+                <w:sz w:val="12"/>
+              </w:rPr>
+              <w:t>INCOTERMS</w:t>
+            </w:r>
+            <w:r>
+              <w:rPr>
+                <w:sz w:val="14"/>
+              </w:rPr>
+              <w:br/>
+              <w:t>{$incoterm}</w:t>
+            </w:r>
+          </w:p>
+        </w:tc>
+        <w:tc>
+          <w:tcPr>
+            <w:tcW w:type="dxa" w:w="2551"/>
+            <w:vAlign w:val="center"/>
+            <w:tcBorders>
+              <w:top w:val="single" w:sz="4" w:color="7E8D97"/>
+              <w:left w:val="single" w:sz="4" w:color="7E8D97"/>
+              <w:bottom w:val="single" w:sz="4" w:color="7E8D97"/>
+              <w:right w:val="single" w:sz="4" w:color="7E8D97"/>
+            </w:tcBorders>
+            <w:tcMar>
+              <w:top w:w="55" w:type="dxa"/>
+              <w:bottom w:w="55" w:type="dxa"/>
+              <w:start w:w="85" w:type="dxa"/>
+              <w:end w:w="85" w:type="dxa"/>
+            </w:tcMar>
+          </w:tcPr>
+          <w:p>
+            <w:r/>
+            <w:r>
+              <w:rPr>
+                <w:b/>
+                <w:color w:val="264860"/>
+                <w:sz w:val="12"/>
+              </w:rPr>
+              <w:t>COLLECTION</w:t>
+            </w:r>
+            <w:r>
+              <w:rPr>
+                <w:sz w:val="14"/>
+              </w:rPr>
+              <w:br/>
+              <w:t>{$collectionDate}</w:t>
+            </w:r>
+          </w:p>
+        </w:tc>
+        <w:tc>
+          <w:tcPr>
+            <w:tcW w:type="dxa" w:w="2551"/>
+            <w:vAlign w:val="center"/>
+            <w:tcBorders>
+              <w:top w:val="single" w:sz="4" w:color="7E8D97"/>
+              <w:left w:val="single" w:sz="4" w:color="7E8D97"/>
+              <w:bottom w:val="single" w:sz="4" w:color="7E8D97"/>
+              <w:right w:val="single" w:sz="4" w:color="7E8D97"/>
+            </w:tcBorders>
+            <w:tcMar>
+              <w:top w:w="55" w:type="dxa"/>
+              <w:bottom w:w="55" w:type="dxa"/>
+              <w:start w:w="85" w:type="dxa"/>
+              <w:end w:w="85" w:type="dxa"/>
+            </w:tcMar>
+          </w:tcPr>
+          <w:p>
+            <w:r/>
+            <w:r>
+              <w:rPr>
+                <w:b/>
+                <w:color w:val="264860"/>
+                <w:sz w:val="12"/>
+              </w:rPr>
+              <w:t>DELIVERY</w:t>
+            </w:r>
+            <w:r>
+              <w:rPr>
+                <w:sz w:val="14"/>
+              </w:rPr>
+              <w:br/>
+              <w:t>{$deliveryDate}</w:t>
+            </w:r>
+          </w:p>
+        </w:tc>
+      </w:tr>
+    </w:tbl>
     <w:p>
+      <w:pPr>
+        <w:spacing w:line="24" w:lineRule="auto"/>
+      </w:pPr>
       <w:r>
         <w:rPr>
-          <w:b/>
+          <w:sz w:val="2"/>
         </w:rPr>
-        <w:t xml:space="preserve">Planned collection  </w:t>
-      </w:r>
-      <w:r>
-        <w:t>{d.bookingConfirmation.collection.plannedAtLabel}</w:t>
-      </w:r>
-    </w:p>
-    <w:p>
-      <w:r>
-        <w:rPr>
-          <w:b/>
-        </w:rPr>
-        <w:t xml:space="preserve">Collection remarks  </w:t>
-      </w:r>
-      <w:r>
-        <w:t>{d.bookingConfirmation.collection.remarks}</w:t>
-      </w:r>
-    </w:p>
-    <w:p>
-      <w:r>
-        <w:t>{d.bookingConfirmation.scope.collection:showEnd}</w:t>
-      </w:r>
-    </w:p>
-    <w:p>
-      <w:r>
         <w:t>{d.bookingConfirmation.scope.mainTransport:ifEQ(true):showBegin}</w:t>
       </w:r>
     </w:p>
     <w:p>
       <w:pPr>
-        <w:spacing w:after="40"/>
+        <w:spacing w:line="24" w:lineRule="auto"/>
       </w:pPr>
       <w:r>
-        <w:t>{#t=d.bookingConfirmation.mainTransport}</w:t>
+        <w:rPr>
+          <w:sz w:val="2"/>
+        </w:rPr>
+        <w:t>{#transport=d.bookingConfirmation.mainTransport}</w:t>
       </w:r>
       <w:r>
-        <w:t>{#origin=d.bookingConfirmation.mainTransport[i].origin}</w:t>
+        <w:rPr>
+          <w:sz w:val="2"/>
+        </w:rPr>
+        <w:t>{#from=d.bookingConfirmation.mainTransport[i].origin}</w:t>
       </w:r>
       <w:r>
-        <w:t>{#destination=d.bookingConfirmation.mainTransport[i].destination}</w:t>
+        <w:rPr>
+          <w:sz w:val="2"/>
+        </w:rPr>
+        <w:t>{#to=d.bookingConfirmation.mainTransport[i].destination}</w:t>
       </w:r>
       <w:r>
-        <w:t>{#departure=d.bookingConfirmation.mainTransport[i].plannedDepartureAt:formatD('DD MMM YYYY HH:mm')}</w:t>
+        <w:rPr>
+          <w:sz w:val="2"/>
+        </w:rPr>
+        <w:t>{#departureDate=d.bookingConfirmation.mainTransport[i].plannedDepartureAt:substr(0,10)}</w:t>
       </w:r>
       <w:r>
-        <w:t>{#arrival=d.bookingConfirmation.mainTransport[i].plannedArrivalAt:formatD('DD MMM YYYY HH:mm')}</w:t>
+        <w:rPr>
+          <w:sz w:val="2"/>
+        </w:rPr>
+        <w:t>{#departureTime=d.bookingConfirmation.mainTransport[i].plannedDepartureAt:substr(11,16)}</w:t>
+      </w:r>
+      <w:r>
+        <w:rPr>
+          <w:sz w:val="2"/>
+        </w:rPr>
+        <w:t>{#arrivalDate=d.bookingConfirmation.mainTransport[i].plannedArrivalAt:substr(0,10)}</w:t>
+      </w:r>
+      <w:r>
+        <w:rPr>
+          <w:sz w:val="2"/>
+        </w:rPr>
+        <w:t>{#arrivalTime=d.bookingConfirmation.mainTransport[i].plannedArrivalAt:substr(11,16)}</w:t>
+      </w:r>
+      <w:r>
+        <w:rPr>
+          <w:sz w:val="2"/>
+        </w:rPr>
+        <w:t>{#routeDetails=d.bookingConfirmation.mainTransport[i].details}</w:t>
       </w:r>
     </w:p>
     <w:p>
       <w:pPr>
-        <w:pStyle w:val="Heading1"/>
+        <w:spacing w:before="120" w:after="40"/>
       </w:pPr>
       <w:r>
-        <w:t>Main transport</w:t>
+        <w:rPr>
+          <w:b/>
+          <w:color w:val="264860"/>
+          <w:sz w:val="14"/>
+        </w:rPr>
+        <w:t>MAIN TRANSPORT</w:t>
       </w:r>
     </w:p>
     <w:tbl>
       <w:tblPr>
-        <w:tblStyle w:val="TableGrid"/>
         <w:tblW w:type="auto" w:w="0"/>
         <w:tblLayout w:type="fixed"/>
         <w:tblLook w:firstColumn="1" w:firstRow="1" w:lastColumn="0" w:lastRow="0" w:noHBand="0" w:noVBand="1" w:val="04A0"/>
       </w:tblPr>
       <w:tblGrid>
-        <w:gridCol w:w="1247"/>
-        <w:gridCol w:w="1928"/>
-        <w:gridCol w:w="1928"/>
-        <w:gridCol w:w="2324"/>
-        <w:gridCol w:w="2381"/>
+        <w:gridCol w:w="1020"/>
+        <w:gridCol w:w="2665"/>
+        <w:gridCol w:w="2551"/>
+        <w:gridCol w:w="3969"/>
       </w:tblGrid>
       <w:tr>
         <w:trPr>
@@ -259,73 +804,619 @@
         </w:trPr>
         <w:tc>
           <w:tcPr>
-            <w:tcW w:type="dxa" w:w="1247"/>
+            <w:tcW w:type="dxa" w:w="1020"/>
             <w:vAlign w:val="center"/>
+            <w:tcBorders>
+              <w:top w:val="single" w:sz="4" w:color="7E8D97"/>
+              <w:left w:val="single" w:sz="4" w:color="7E8D97"/>
+              <w:bottom w:val="single" w:sz="4" w:color="7E8D97"/>
+              <w:right w:val="single" w:sz="4" w:color="7E8D97"/>
+            </w:tcBorders>
+            <w:tcMar>
+              <w:top w:w="55" w:type="dxa"/>
+              <w:bottom w:w="55" w:type="dxa"/>
+              <w:start w:w="85" w:type="dxa"/>
+              <w:end w:w="85" w:type="dxa"/>
+            </w:tcMar>
           </w:tcPr>
           <w:p>
-            <w:pPr>
-              <w:spacing w:after="40"/>
-            </w:pPr>
             <w:r>
               <w:rPr>
                 <w:b/>
-                <w:sz w:val="16"/>
+                <w:color w:val="264860"/>
+                <w:sz w:val="12"/>
               </w:rPr>
-              <w:t>Mode</w:t>
+              <w:t>MODE</w:t>
             </w:r>
           </w:p>
         </w:tc>
         <w:tc>
           <w:tcPr>
-            <w:tcW w:type="dxa" w:w="1928"/>
+            <w:tcW w:type="dxa" w:w="2665"/>
             <w:vAlign w:val="center"/>
+            <w:tcBorders>
+              <w:top w:val="single" w:sz="4" w:color="7E8D97"/>
+              <w:left w:val="single" w:sz="4" w:color="7E8D97"/>
+              <w:bottom w:val="single" w:sz="4" w:color="7E8D97"/>
+              <w:right w:val="single" w:sz="4" w:color="7E8D97"/>
+            </w:tcBorders>
+            <w:tcMar>
+              <w:top w:w="55" w:type="dxa"/>
+              <w:bottom w:w="55" w:type="dxa"/>
+              <w:start w:w="85" w:type="dxa"/>
+              <w:end w:w="85" w:type="dxa"/>
+            </w:tcMar>
           </w:tcPr>
           <w:p>
-            <w:pPr>
-              <w:spacing w:after="40"/>
-            </w:pPr>
             <w:r>
               <w:rPr>
                 <w:b/>
-                <w:sz w:val="16"/>
+                <w:color w:val="264860"/>
+                <w:sz w:val="12"/>
               </w:rPr>
-              <w:t>From</w:t>
+              <w:t>FROM / TO</w:t>
             </w:r>
           </w:p>
         </w:tc>
         <w:tc>
           <w:tcPr>
-            <w:tcW w:type="dxa" w:w="1928"/>
+            <w:tcW w:type="dxa" w:w="2551"/>
             <w:vAlign w:val="center"/>
+            <w:tcBorders>
+              <w:top w:val="single" w:sz="4" w:color="7E8D97"/>
+              <w:left w:val="single" w:sz="4" w:color="7E8D97"/>
+              <w:bottom w:val="single" w:sz="4" w:color="7E8D97"/>
+              <w:right w:val="single" w:sz="4" w:color="7E8D97"/>
+            </w:tcBorders>
+            <w:tcMar>
+              <w:top w:w="55" w:type="dxa"/>
+              <w:bottom w:w="55" w:type="dxa"/>
+              <w:start w:w="85" w:type="dxa"/>
+              <w:end w:w="85" w:type="dxa"/>
+            </w:tcMar>
           </w:tcPr>
           <w:p>
-            <w:pPr>
-              <w:spacing w:after="40"/>
-            </w:pPr>
             <w:r>
               <w:rPr>
                 <w:b/>
-                <w:sz w:val="16"/>
+                <w:color w:val="264860"/>
+                <w:sz w:val="12"/>
               </w:rPr>
-              <w:t>To</w:t>
+              <w:t>PLANNED UTC</w:t>
             </w:r>
           </w:p>
         </w:tc>
         <w:tc>
           <w:tcPr>
-            <w:tcW w:type="dxa" w:w="2324"/>
+            <w:tcW w:type="dxa" w:w="3969"/>
             <w:vAlign w:val="center"/>
+            <w:tcBorders>
+              <w:top w:val="single" w:sz="4" w:color="7E8D97"/>
+              <w:left w:val="single" w:sz="4" w:color="7E8D97"/>
+              <w:bottom w:val="single" w:sz="4" w:color="7E8D97"/>
+              <w:right w:val="single" w:sz="4" w:color="7E8D97"/>
+            </w:tcBorders>
+            <w:tcMar>
+              <w:top w:w="55" w:type="dxa"/>
+              <w:bottom w:w="55" w:type="dxa"/>
+              <w:start w:w="85" w:type="dxa"/>
+              <w:end w:w="85" w:type="dxa"/>
+            </w:tcMar>
           </w:tcPr>
           <w:p>
-            <w:pPr>
-              <w:spacing w:after="40"/>
-            </w:pPr>
             <w:r>
               <w:rPr>
                 <w:b/>
-                <w:sz w:val="16"/>
+                <w:color w:val="264860"/>
+                <w:sz w:val="12"/>
               </w:rPr>
-              <w:t>Planned departure (UTC)</w:t>
+              <w:t>SERVICE AND REFERENCES</w:t>
+            </w:r>
+          </w:p>
+        </w:tc>
+      </w:tr>
+      <w:tr>
+        <w:trPr>
+          <w:cantSplit/>
+        </w:trPr>
+        <w:tc>
+          <w:tcPr>
+            <w:tcW w:type="dxa" w:w="1020"/>
+            <w:tcBorders>
+              <w:top w:val="single" w:sz="4" w:color="7E8D97"/>
+              <w:left w:val="single" w:sz="4" w:color="7E8D97"/>
+              <w:bottom w:val="single" w:sz="4" w:color="7E8D97"/>
+              <w:right w:val="single" w:sz="4" w:color="7E8D97"/>
+            </w:tcBorders>
+            <w:tcMar>
+              <w:top w:w="55" w:type="dxa"/>
+              <w:bottom w:w="55" w:type="dxa"/>
+              <w:start w:w="85" w:type="dxa"/>
+              <w:end w:w="85" w:type="dxa"/>
+            </w:tcMar>
+          </w:tcPr>
+          <w:p>
+            <w:r>
+              <w:rPr>
+                <w:sz w:val="14"/>
+              </w:rPr>
+              <w:t>{$transport[i].mode}</w:t>
+            </w:r>
+          </w:p>
+        </w:tc>
+        <w:tc>
+          <w:tcPr>
+            <w:tcW w:type="dxa" w:w="2665"/>
+            <w:tcBorders>
+              <w:top w:val="single" w:sz="4" w:color="7E8D97"/>
+              <w:left w:val="single" w:sz="4" w:color="7E8D97"/>
+              <w:bottom w:val="single" w:sz="4" w:color="7E8D97"/>
+              <w:right w:val="single" w:sz="4" w:color="7E8D97"/>
+            </w:tcBorders>
+            <w:tcMar>
+              <w:top w:w="55" w:type="dxa"/>
+              <w:bottom w:w="55" w:type="dxa"/>
+              <w:start w:w="85" w:type="dxa"/>
+              <w:end w:w="85" w:type="dxa"/>
+            </w:tcMar>
+          </w:tcPr>
+          <w:p>
+            <w:r>
+              <w:rPr>
+                <w:sz w:val="14"/>
+              </w:rPr>
+              <w:t>{$from}</w:t>
+              <w:br/>
+              <w:t>→ {$to}</w:t>
+            </w:r>
+          </w:p>
+        </w:tc>
+        <w:tc>
+          <w:tcPr>
+            <w:tcW w:type="dxa" w:w="2551"/>
+            <w:tcBorders>
+              <w:top w:val="single" w:sz="4" w:color="7E8D97"/>
+              <w:left w:val="single" w:sz="4" w:color="7E8D97"/>
+              <w:bottom w:val="single" w:sz="4" w:color="7E8D97"/>
+              <w:right w:val="single" w:sz="4" w:color="7E8D97"/>
+            </w:tcBorders>
+            <w:tcMar>
+              <w:top w:w="55" w:type="dxa"/>
+              <w:bottom w:w="55" w:type="dxa"/>
+              <w:start w:w="85" w:type="dxa"/>
+              <w:end w:w="85" w:type="dxa"/>
+            </w:tcMar>
+          </w:tcPr>
+          <w:p>
+            <w:r>
+              <w:rPr>
+                <w:sz w:val="14"/>
+              </w:rPr>
+              <w:t>Dep {$departureDate} {$departureTime}</w:t>
+              <w:br/>
+              <w:t>Arr {$arrivalDate} {$arrivalTime}</w:t>
+            </w:r>
+          </w:p>
+        </w:tc>
+        <w:tc>
+          <w:tcPr>
+            <w:tcW w:type="dxa" w:w="3969"/>
+            <w:tcBorders>
+              <w:top w:val="single" w:sz="4" w:color="7E8D97"/>
+              <w:left w:val="single" w:sz="4" w:color="7E8D97"/>
+              <w:bottom w:val="single" w:sz="4" w:color="7E8D97"/>
+              <w:right w:val="single" w:sz="4" w:color="7E8D97"/>
+            </w:tcBorders>
+            <w:tcMar>
+              <w:top w:w="55" w:type="dxa"/>
+              <w:bottom w:w="55" w:type="dxa"/>
+              <w:start w:w="85" w:type="dxa"/>
+              <w:end w:w="85" w:type="dxa"/>
+            </w:tcMar>
+          </w:tcPr>
+          <w:p>
+            <w:r>
+              <w:rPr>
+                <w:sz w:val="14"/>
+              </w:rPr>
+              <w:t>{$routeDetails}</w:t>
+            </w:r>
+          </w:p>
+        </w:tc>
+      </w:tr>
+      <w:tr>
+        <w:tc>
+          <w:tcPr>
+            <w:tcW w:type="dxa" w:w="1020"/>
+          </w:tcPr>
+          <w:p>
+            <w:r>
+              <w:t>{$transport[i+1]}</w:t>
+            </w:r>
+          </w:p>
+        </w:tc>
+        <w:tc>
+          <w:tcPr>
+            <w:tcW w:type="dxa" w:w="2665"/>
+          </w:tcPr>
+          <w:p>
+            <w:r/>
+          </w:p>
+        </w:tc>
+        <w:tc>
+          <w:tcPr>
+            <w:tcW w:type="dxa" w:w="2551"/>
+          </w:tcPr>
+          <w:p>
+            <w:r/>
+          </w:p>
+        </w:tc>
+        <w:tc>
+          <w:tcPr>
+            <w:tcW w:type="dxa" w:w="3969"/>
+          </w:tcPr>
+          <w:p>
+            <w:r/>
+          </w:p>
+        </w:tc>
+      </w:tr>
+    </w:tbl>
+    <w:p>
+      <w:pPr>
+        <w:spacing w:line="24" w:lineRule="auto"/>
+      </w:pPr>
+      <w:r>
+        <w:rPr>
+          <w:sz w:val="2"/>
+        </w:rPr>
+        <w:t>{d.bookingConfirmation.scope.mainTransport:showEnd}</w:t>
+      </w:r>
+    </w:p>
+    <w:p>
+      <w:pPr>
+        <w:spacing w:line="24" w:lineRule="auto"/>
+      </w:pPr>
+      <w:r>
+        <w:rPr>
+          <w:sz w:val="2"/>
+        </w:rPr>
+        <w:t>{d.bookingConfirmation.hasEquipment:ifEQ(true):showBegin}</w:t>
+      </w:r>
+    </w:p>
+    <w:p>
+      <w:pPr>
+        <w:spacing w:line="24" w:lineRule="auto"/>
+      </w:pPr>
+      <w:r>
+        <w:rPr>
+          <w:sz w:val="2"/>
+        </w:rPr>
+        <w:t>{#equipment=d.bookingConfirmation.equipment}</w:t>
+      </w:r>
+    </w:p>
+    <w:p>
+      <w:pPr>
+        <w:spacing w:before="120" w:after="40"/>
+      </w:pPr>
+      <w:r>
+        <w:rPr>
+          <w:b/>
+          <w:color w:val="264860"/>
+          <w:sz w:val="14"/>
+        </w:rPr>
+        <w:t>TRANSPORT EQUIPMENT</w:t>
+      </w:r>
+    </w:p>
+    <w:tbl>
+      <w:tblPr>
+        <w:tblW w:type="auto" w:w="0"/>
+        <w:tblLayout w:type="fixed"/>
+        <w:tblLook w:firstColumn="1" w:firstRow="1" w:lastColumn="0" w:lastRow="0" w:noHBand="0" w:noVBand="1" w:val="04A0"/>
+      </w:tblPr>
+      <w:tblGrid>
+        <w:gridCol w:w="1984"/>
+        <w:gridCol w:w="5386"/>
+        <w:gridCol w:w="2835"/>
+      </w:tblGrid>
+      <w:tr>
+        <w:trPr>
+          <w:tblHeader w:val="true"/>
+        </w:trPr>
+        <w:tc>
+          <w:tcPr>
+            <w:tcW w:type="dxa" w:w="1984"/>
+            <w:vAlign w:val="center"/>
+            <w:tcBorders>
+              <w:top w:val="single" w:sz="4" w:color="7E8D97"/>
+              <w:left w:val="single" w:sz="4" w:color="7E8D97"/>
+              <w:bottom w:val="single" w:sz="4" w:color="7E8D97"/>
+              <w:right w:val="single" w:sz="4" w:color="7E8D97"/>
+            </w:tcBorders>
+            <w:tcMar>
+              <w:top w:w="55" w:type="dxa"/>
+              <w:bottom w:w="55" w:type="dxa"/>
+              <w:start w:w="85" w:type="dxa"/>
+              <w:end w:w="85" w:type="dxa"/>
+            </w:tcMar>
+          </w:tcPr>
+          <w:p>
+            <w:r>
+              <w:rPr>
+                <w:b/>
+                <w:color w:val="264860"/>
+                <w:sz w:val="12"/>
+              </w:rPr>
+              <w:t>KIND</w:t>
+            </w:r>
+          </w:p>
+        </w:tc>
+        <w:tc>
+          <w:tcPr>
+            <w:tcW w:type="dxa" w:w="5386"/>
+            <w:vAlign w:val="center"/>
+            <w:tcBorders>
+              <w:top w:val="single" w:sz="4" w:color="7E8D97"/>
+              <w:left w:val="single" w:sz="4" w:color="7E8D97"/>
+              <w:bottom w:val="single" w:sz="4" w:color="7E8D97"/>
+              <w:right w:val="single" w:sz="4" w:color="7E8D97"/>
+            </w:tcBorders>
+            <w:tcMar>
+              <w:top w:w="55" w:type="dxa"/>
+              <w:bottom w:w="55" w:type="dxa"/>
+              <w:start w:w="85" w:type="dxa"/>
+              <w:end w:w="85" w:type="dxa"/>
+            </w:tcMar>
+          </w:tcPr>
+          <w:p>
+            <w:r>
+              <w:rPr>
+                <w:b/>
+                <w:color w:val="264860"/>
+                <w:sz w:val="12"/>
+              </w:rPr>
+              <w:t>NUMBER</w:t>
+            </w:r>
+          </w:p>
+        </w:tc>
+        <w:tc>
+          <w:tcPr>
+            <w:tcW w:type="dxa" w:w="2835"/>
+            <w:vAlign w:val="center"/>
+            <w:tcBorders>
+              <w:top w:val="single" w:sz="4" w:color="7E8D97"/>
+              <w:left w:val="single" w:sz="4" w:color="7E8D97"/>
+              <w:bottom w:val="single" w:sz="4" w:color="7E8D97"/>
+              <w:right w:val="single" w:sz="4" w:color="7E8D97"/>
+            </w:tcBorders>
+            <w:tcMar>
+              <w:top w:w="55" w:type="dxa"/>
+              <w:bottom w:w="55" w:type="dxa"/>
+              <w:start w:w="85" w:type="dxa"/>
+              <w:end w:w="85" w:type="dxa"/>
+            </w:tcMar>
+          </w:tcPr>
+          <w:p>
+            <w:r>
+              <w:rPr>
+                <w:b/>
+                <w:color w:val="264860"/>
+                <w:sz w:val="12"/>
+              </w:rPr>
+              <w:t>TYPE</w:t>
+            </w:r>
+          </w:p>
+        </w:tc>
+      </w:tr>
+      <w:tr>
+        <w:trPr>
+          <w:cantSplit/>
+        </w:trPr>
+        <w:tc>
+          <w:tcPr>
+            <w:tcW w:type="dxa" w:w="1984"/>
+            <w:tcBorders>
+              <w:top w:val="single" w:sz="4" w:color="7E8D97"/>
+              <w:left w:val="single" w:sz="4" w:color="7E8D97"/>
+              <w:bottom w:val="single" w:sz="4" w:color="7E8D97"/>
+              <w:right w:val="single" w:sz="4" w:color="7E8D97"/>
+            </w:tcBorders>
+            <w:tcMar>
+              <w:top w:w="55" w:type="dxa"/>
+              <w:bottom w:w="55" w:type="dxa"/>
+              <w:start w:w="85" w:type="dxa"/>
+              <w:end w:w="85" w:type="dxa"/>
+            </w:tcMar>
+          </w:tcPr>
+          <w:p>
+            <w:r>
+              <w:rPr>
+                <w:sz w:val="14"/>
+              </w:rPr>
+              <w:t>{$equipment[i].kind}</w:t>
+            </w:r>
+          </w:p>
+        </w:tc>
+        <w:tc>
+          <w:tcPr>
+            <w:tcW w:type="dxa" w:w="5386"/>
+            <w:tcBorders>
+              <w:top w:val="single" w:sz="4" w:color="7E8D97"/>
+              <w:left w:val="single" w:sz="4" w:color="7E8D97"/>
+              <w:bottom w:val="single" w:sz="4" w:color="7E8D97"/>
+              <w:right w:val="single" w:sz="4" w:color="7E8D97"/>
+            </w:tcBorders>
+            <w:tcMar>
+              <w:top w:w="55" w:type="dxa"/>
+              <w:bottom w:w="55" w:type="dxa"/>
+              <w:start w:w="85" w:type="dxa"/>
+              <w:end w:w="85" w:type="dxa"/>
+            </w:tcMar>
+          </w:tcPr>
+          <w:p>
+            <w:r>
+              <w:rPr>
+                <w:sz w:val="14"/>
+              </w:rPr>
+              <w:t>{$equipment[i].number}</w:t>
+            </w:r>
+          </w:p>
+        </w:tc>
+        <w:tc>
+          <w:tcPr>
+            <w:tcW w:type="dxa" w:w="2835"/>
+            <w:tcBorders>
+              <w:top w:val="single" w:sz="4" w:color="7E8D97"/>
+              <w:left w:val="single" w:sz="4" w:color="7E8D97"/>
+              <w:bottom w:val="single" w:sz="4" w:color="7E8D97"/>
+              <w:right w:val="single" w:sz="4" w:color="7E8D97"/>
+            </w:tcBorders>
+            <w:tcMar>
+              <w:top w:w="55" w:type="dxa"/>
+              <w:bottom w:w="55" w:type="dxa"/>
+              <w:start w:w="85" w:type="dxa"/>
+              <w:end w:w="85" w:type="dxa"/>
+            </w:tcMar>
+          </w:tcPr>
+          <w:p>
+            <w:r>
+              <w:rPr>
+                <w:sz w:val="14"/>
+              </w:rPr>
+              <w:t>{$equipment[i].type}</w:t>
+            </w:r>
+          </w:p>
+        </w:tc>
+      </w:tr>
+      <w:tr>
+        <w:tc>
+          <w:tcPr>
+            <w:tcW w:type="dxa" w:w="1984"/>
+          </w:tcPr>
+          <w:p>
+            <w:r>
+              <w:t>{$equipment[i+1]}</w:t>
+            </w:r>
+          </w:p>
+        </w:tc>
+        <w:tc>
+          <w:tcPr>
+            <w:tcW w:type="dxa" w:w="5386"/>
+          </w:tcPr>
+          <w:p>
+            <w:r/>
+          </w:p>
+        </w:tc>
+        <w:tc>
+          <w:tcPr>
+            <w:tcW w:type="dxa" w:w="2835"/>
+          </w:tcPr>
+          <w:p>
+            <w:r/>
+          </w:p>
+        </w:tc>
+      </w:tr>
+    </w:tbl>
+    <w:p>
+      <w:pPr>
+        <w:spacing w:line="24" w:lineRule="auto"/>
+      </w:pPr>
+      <w:r>
+        <w:rPr>
+          <w:sz w:val="2"/>
+        </w:rPr>
+        <w:t>{d.bookingConfirmation.hasEquipment:showEnd}</w:t>
+      </w:r>
+    </w:p>
+    <w:p>
+      <w:pPr>
+        <w:spacing w:line="24" w:lineRule="auto"/>
+      </w:pPr>
+      <w:r>
+        <w:rPr>
+          <w:sz w:val="2"/>
+        </w:rPr>
+        <w:t>{#goods=d.bookingConfirmation.cargo}</w:t>
+      </w:r>
+      <w:r>
+        <w:rPr>
+          <w:sz w:val="2"/>
+        </w:rPr>
+        <w:t>{#marks=d.bookingConfirmation.cargo[i].marksAndNumbers}</w:t>
+      </w:r>
+      <w:r>
+        <w:rPr>
+          <w:sz w:val="2"/>
+        </w:rPr>
+        <w:t>{#packages=d.bookingConfirmation.cargo[i].packages}</w:t>
+      </w:r>
+      <w:r>
+        <w:rPr>
+          <w:sz w:val="2"/>
+        </w:rPr>
+        <w:t>{#packageType=d.bookingConfirmation.cargo[i].packageType}</w:t>
+      </w:r>
+      <w:r>
+        <w:rPr>
+          <w:sz w:val="2"/>
+        </w:rPr>
+        <w:t>{#weight=d.bookingConfirmation.cargo[i].grossWeightKg}</w:t>
+      </w:r>
+    </w:p>
+    <w:p>
+      <w:pPr>
+        <w:spacing w:before="120" w:after="40"/>
+      </w:pPr>
+      <w:r>
+        <w:rPr>
+          <w:b/>
+          <w:color w:val="264860"/>
+          <w:sz w:val="14"/>
+        </w:rPr>
+        <w:t>SHIPMENT INFORMATION</w:t>
+      </w:r>
+    </w:p>
+    <w:tbl>
+      <w:tblPr>
+        <w:tblW w:type="auto" w:w="0"/>
+        <w:tblLayout w:type="fixed"/>
+        <w:tblLook w:firstColumn="1" w:firstRow="1" w:lastColumn="0" w:lastRow="0" w:noHBand="0" w:noVBand="1" w:val="04A0"/>
+      </w:tblPr>
+      <w:tblGrid>
+        <w:gridCol w:w="3231"/>
+        <w:gridCol w:w="2381"/>
+        <w:gridCol w:w="1077"/>
+        <w:gridCol w:w="1701"/>
+        <w:gridCol w:w="1814"/>
+      </w:tblGrid>
+      <w:tr>
+        <w:trPr>
+          <w:tblHeader w:val="true"/>
+        </w:trPr>
+        <w:tc>
+          <w:tcPr>
+            <w:tcW w:type="dxa" w:w="3231"/>
+            <w:vAlign w:val="center"/>
+            <w:tcBorders>
+              <w:top w:val="single" w:sz="4" w:color="7E8D97"/>
+              <w:left w:val="single" w:sz="4" w:color="7E8D97"/>
+              <w:bottom w:val="single" w:sz="4" w:color="7E8D97"/>
+              <w:right w:val="single" w:sz="4" w:color="7E8D97"/>
+            </w:tcBorders>
+            <w:tcMar>
+              <w:top w:w="55" w:type="dxa"/>
+              <w:bottom w:w="55" w:type="dxa"/>
+              <w:start w:w="85" w:type="dxa"/>
+              <w:end w:w="85" w:type="dxa"/>
+            </w:tcMar>
+          </w:tcPr>
+          <w:p>
+            <w:r>
+              <w:rPr>
+                <w:b/>
+                <w:color w:val="264860"/>
+                <w:sz w:val="12"/>
+              </w:rPr>
+              <w:t>DESCRIPTION</w:t>
             </w:r>
           </w:p>
         </w:tc>
@@ -333,415 +1424,164 @@
           <w:tcPr>
             <w:tcW w:type="dxa" w:w="2381"/>
             <w:vAlign w:val="center"/>
+            <w:tcBorders>
+              <w:top w:val="single" w:sz="4" w:color="7E8D97"/>
+              <w:left w:val="single" w:sz="4" w:color="7E8D97"/>
+              <w:bottom w:val="single" w:sz="4" w:color="7E8D97"/>
+              <w:right w:val="single" w:sz="4" w:color="7E8D97"/>
+            </w:tcBorders>
+            <w:tcMar>
+              <w:top w:w="55" w:type="dxa"/>
+              <w:bottom w:w="55" w:type="dxa"/>
+              <w:start w:w="85" w:type="dxa"/>
+              <w:end w:w="85" w:type="dxa"/>
+            </w:tcMar>
           </w:tcPr>
           <w:p>
-            <w:pPr>
-              <w:spacing w:after="40"/>
-            </w:pPr>
             <w:r>
               <w:rPr>
                 <w:b/>
-                <w:sz w:val="16"/>
+                <w:color w:val="264860"/>
+                <w:sz w:val="12"/>
               </w:rPr>
-              <w:t>Planned arrival (UTC)</w:t>
+              <w:t>MARKS AND NUMBERS</w:t>
+            </w:r>
+          </w:p>
+        </w:tc>
+        <w:tc>
+          <w:tcPr>
+            <w:tcW w:type="dxa" w:w="1077"/>
+            <w:vAlign w:val="center"/>
+            <w:tcBorders>
+              <w:top w:val="single" w:sz="4" w:color="7E8D97"/>
+              <w:left w:val="single" w:sz="4" w:color="7E8D97"/>
+              <w:bottom w:val="single" w:sz="4" w:color="7E8D97"/>
+              <w:right w:val="single" w:sz="4" w:color="7E8D97"/>
+            </w:tcBorders>
+            <w:tcMar>
+              <w:top w:w="55" w:type="dxa"/>
+              <w:bottom w:w="55" w:type="dxa"/>
+              <w:start w:w="85" w:type="dxa"/>
+              <w:end w:w="85" w:type="dxa"/>
+            </w:tcMar>
+          </w:tcPr>
+          <w:p>
+            <w:r>
+              <w:rPr>
+                <w:b/>
+                <w:color w:val="264860"/>
+                <w:sz w:val="12"/>
+              </w:rPr>
+              <w:t>PACKAGES</w:t>
+            </w:r>
+          </w:p>
+        </w:tc>
+        <w:tc>
+          <w:tcPr>
+            <w:tcW w:type="dxa" w:w="1701"/>
+            <w:vAlign w:val="center"/>
+            <w:tcBorders>
+              <w:top w:val="single" w:sz="4" w:color="7E8D97"/>
+              <w:left w:val="single" w:sz="4" w:color="7E8D97"/>
+              <w:bottom w:val="single" w:sz="4" w:color="7E8D97"/>
+              <w:right w:val="single" w:sz="4" w:color="7E8D97"/>
+            </w:tcBorders>
+            <w:tcMar>
+              <w:top w:w="55" w:type="dxa"/>
+              <w:bottom w:w="55" w:type="dxa"/>
+              <w:start w:w="85" w:type="dxa"/>
+              <w:end w:w="85" w:type="dxa"/>
+            </w:tcMar>
+          </w:tcPr>
+          <w:p>
+            <w:r>
+              <w:rPr>
+                <w:b/>
+                <w:color w:val="264860"/>
+                <w:sz w:val="12"/>
+              </w:rPr>
+              <w:t>TYPE</w:t>
+            </w:r>
+          </w:p>
+        </w:tc>
+        <w:tc>
+          <w:tcPr>
+            <w:tcW w:type="dxa" w:w="1814"/>
+            <w:vAlign w:val="center"/>
+            <w:tcBorders>
+              <w:top w:val="single" w:sz="4" w:color="7E8D97"/>
+              <w:left w:val="single" w:sz="4" w:color="7E8D97"/>
+              <w:bottom w:val="single" w:sz="4" w:color="7E8D97"/>
+              <w:right w:val="single" w:sz="4" w:color="7E8D97"/>
+            </w:tcBorders>
+            <w:tcMar>
+              <w:top w:w="55" w:type="dxa"/>
+              <w:bottom w:w="55" w:type="dxa"/>
+              <w:start w:w="85" w:type="dxa"/>
+              <w:end w:w="85" w:type="dxa"/>
+            </w:tcMar>
+          </w:tcPr>
+          <w:p>
+            <w:r>
+              <w:rPr>
+                <w:b/>
+                <w:color w:val="264860"/>
+                <w:sz w:val="12"/>
+              </w:rPr>
+              <w:t>WEIGHT KG</w:t>
             </w:r>
           </w:p>
         </w:tc>
       </w:tr>
       <w:tr>
+        <w:trPr>
+          <w:cantSplit/>
+        </w:trPr>
         <w:tc>
           <w:tcPr>
-            <w:tcW w:type="dxa" w:w="1247"/>
-            <w:vAlign w:val="center"/>
+            <w:tcW w:type="dxa" w:w="3231"/>
+            <w:tcBorders>
+              <w:top w:val="single" w:sz="4" w:color="7E8D97"/>
+              <w:left w:val="single" w:sz="4" w:color="7E8D97"/>
+              <w:bottom w:val="single" w:sz="4" w:color="7E8D97"/>
+              <w:right w:val="single" w:sz="4" w:color="7E8D97"/>
+            </w:tcBorders>
+            <w:tcMar>
+              <w:top w:w="55" w:type="dxa"/>
+              <w:bottom w:w="55" w:type="dxa"/>
+              <w:start w:w="85" w:type="dxa"/>
+              <w:end w:w="85" w:type="dxa"/>
+            </w:tcMar>
           </w:tcPr>
           <w:p>
-            <w:pPr>
-              <w:spacing w:after="40"/>
-            </w:pPr>
             <w:r>
               <w:rPr>
-                <w:sz w:val="16"/>
+                <w:sz w:val="14"/>
               </w:rPr>
-              <w:t>{$t[i].mode}</w:t>
-            </w:r>
-          </w:p>
-        </w:tc>
-        <w:tc>
-          <w:tcPr>
-            <w:tcW w:type="dxa" w:w="1928"/>
-            <w:vAlign w:val="center"/>
-          </w:tcPr>
-          <w:p>
-            <w:pPr>
-              <w:spacing w:after="40"/>
-            </w:pPr>
-            <w:r>
-              <w:rPr>
-                <w:sz w:val="16"/>
-              </w:rPr>
-              <w:t>{$origin}</w:t>
-            </w:r>
-          </w:p>
-        </w:tc>
-        <w:tc>
-          <w:tcPr>
-            <w:tcW w:type="dxa" w:w="1928"/>
-            <w:vAlign w:val="center"/>
-          </w:tcPr>
-          <w:p>
-            <w:pPr>
-              <w:spacing w:after="40"/>
-            </w:pPr>
-            <w:r>
-              <w:rPr>
-                <w:sz w:val="16"/>
-              </w:rPr>
-              <w:t>{$destination}</w:t>
-            </w:r>
-          </w:p>
-        </w:tc>
-        <w:tc>
-          <w:tcPr>
-            <w:tcW w:type="dxa" w:w="2324"/>
-            <w:vAlign w:val="center"/>
-          </w:tcPr>
-          <w:p>
-            <w:pPr>
-              <w:spacing w:after="40"/>
-            </w:pPr>
-            <w:r>
-              <w:rPr>
-                <w:sz w:val="16"/>
-              </w:rPr>
-              <w:t>{$departure}</w:t>
+              <w:t>{$goods[i].description}</w:t>
             </w:r>
           </w:p>
         </w:tc>
         <w:tc>
           <w:tcPr>
             <w:tcW w:type="dxa" w:w="2381"/>
-            <w:vAlign w:val="center"/>
+            <w:tcBorders>
+              <w:top w:val="single" w:sz="4" w:color="7E8D97"/>
+              <w:left w:val="single" w:sz="4" w:color="7E8D97"/>
+              <w:bottom w:val="single" w:sz="4" w:color="7E8D97"/>
+              <w:right w:val="single" w:sz="4" w:color="7E8D97"/>
+            </w:tcBorders>
+            <w:tcMar>
+              <w:top w:w="55" w:type="dxa"/>
+              <w:bottom w:w="55" w:type="dxa"/>
+              <w:start w:w="85" w:type="dxa"/>
+              <w:end w:w="85" w:type="dxa"/>
+            </w:tcMar>
           </w:tcPr>
           <w:p>
-            <w:pPr>
-              <w:spacing w:after="40"/>
-            </w:pPr>
             <w:r>
               <w:rPr>
-                <w:sz w:val="16"/>
-              </w:rPr>
-              <w:t>{$arrival}</w:t>
-            </w:r>
-          </w:p>
-        </w:tc>
-      </w:tr>
-      <w:tr>
-        <w:tc>
-          <w:tcPr>
-            <w:tcW w:type="dxa" w:w="1247"/>
-          </w:tcPr>
-          <w:p>
-            <w:pPr>
-              <w:spacing w:after="40"/>
-            </w:pPr>
-            <w:r>
-              <w:rPr>
-                <w:sz w:val="16"/>
-              </w:rPr>
-              <w:t>{$t[i+1]}</w:t>
-            </w:r>
-          </w:p>
-        </w:tc>
-        <w:tc>
-          <w:tcPr>
-            <w:tcW w:type="dxa" w:w="1928"/>
-          </w:tcPr>
-          <w:p>
-            <w:pPr>
-              <w:spacing w:after="40"/>
-            </w:pPr>
-            <w:r>
-              <w:rPr>
-                <w:sz w:val="16"/>
-              </w:rPr>
-            </w:r>
-          </w:p>
-        </w:tc>
-        <w:tc>
-          <w:tcPr>
-            <w:tcW w:type="dxa" w:w="1928"/>
-          </w:tcPr>
-          <w:p>
-            <w:pPr>
-              <w:spacing w:after="40"/>
-            </w:pPr>
-            <w:r>
-              <w:rPr>
-                <w:sz w:val="16"/>
-              </w:rPr>
-            </w:r>
-          </w:p>
-        </w:tc>
-        <w:tc>
-          <w:tcPr>
-            <w:tcW w:type="dxa" w:w="2324"/>
-          </w:tcPr>
-          <w:p>
-            <w:pPr>
-              <w:spacing w:after="40"/>
-            </w:pPr>
-            <w:r>
-              <w:rPr>
-                <w:sz w:val="16"/>
-              </w:rPr>
-            </w:r>
-          </w:p>
-        </w:tc>
-        <w:tc>
-          <w:tcPr>
-            <w:tcW w:type="dxa" w:w="2381"/>
-          </w:tcPr>
-          <w:p>
-            <w:pPr>
-              <w:spacing w:after="40"/>
-            </w:pPr>
-            <w:r>
-              <w:rPr>
-                <w:sz w:val="16"/>
-              </w:rPr>
-            </w:r>
-          </w:p>
-        </w:tc>
-      </w:tr>
-    </w:tbl>
-    <w:p>
-      <w:pPr>
-        <w:spacing w:after="0"/>
-      </w:pPr>
-    </w:p>
-    <w:p>
-      <w:r>
-        <w:t>{d.bookingConfirmation.scope.mainTransport:showEnd}</w:t>
-      </w:r>
-    </w:p>
-    <w:p>
-      <w:r>
-        <w:t>{d.bookingConfirmation.scope.delivery:ifEQ(true):showBegin}</w:t>
-      </w:r>
-    </w:p>
-    <w:p>
-      <w:pPr>
-        <w:pStyle w:val="Heading1"/>
-      </w:pPr>
-      <w:r>
-        <w:t>Delivery</w:t>
-      </w:r>
-    </w:p>
-    <w:p>
-      <w:r>
-        <w:rPr>
-          <w:b/>
-        </w:rPr>
-        <w:t xml:space="preserve">Delivery address  </w:t>
-      </w:r>
-      <w:r>
-        <w:t>{d.bookingConfirmation.delivery.address}</w:t>
-      </w:r>
-    </w:p>
-    <w:p>
-      <w:r>
-        <w:rPr>
-          <w:b/>
-        </w:rPr>
-        <w:t xml:space="preserve">Planned delivery  </w:t>
-      </w:r>
-      <w:r>
-        <w:t>{d.bookingConfirmation.delivery.plannedAtLabel}</w:t>
-      </w:r>
-    </w:p>
-    <w:p>
-      <w:r>
-        <w:rPr>
-          <w:b/>
-        </w:rPr>
-        <w:t xml:space="preserve">Delivery remarks  </w:t>
-      </w:r>
-      <w:r>
-        <w:t>{d.bookingConfirmation.delivery.remarks}</w:t>
-      </w:r>
-    </w:p>
-    <w:p>
-      <w:r>
-        <w:t>{d.bookingConfirmation.scope.delivery:showEnd}</w:t>
-      </w:r>
-    </w:p>
-    <w:p>
-      <w:pPr>
-        <w:spacing w:after="40"/>
-      </w:pPr>
-      <w:r>
-        <w:t>{#g=d.bookingConfirmation.cargo}</w:t>
-      </w:r>
-      <w:r>
-        <w:t>{#marks=d.bookingConfirmation.cargo[i].marksAndNumbers}</w:t>
-      </w:r>
-      <w:r>
-        <w:t>{#packages=d.bookingConfirmation.cargo[i].packages}</w:t>
-      </w:r>
-      <w:r>
-        <w:t>{#packageType=d.bookingConfirmation.cargo[i].packageType}</w:t>
-      </w:r>
-      <w:r>
-        <w:t>{#weight=d.bookingConfirmation.cargo[i].grossWeightKg}</w:t>
-      </w:r>
-    </w:p>
-    <w:p>
-      <w:pPr>
-        <w:pStyle w:val="Heading1"/>
-      </w:pPr>
-      <w:r>
-        <w:t>Goods</w:t>
-      </w:r>
-    </w:p>
-    <w:tbl>
-      <w:tblPr>
-        <w:tblStyle w:val="TableGrid"/>
-        <w:tblW w:type="auto" w:w="0"/>
-        <w:tblLayout w:type="fixed"/>
-        <w:tblLook w:firstColumn="1" w:firstRow="1" w:lastColumn="0" w:lastRow="0" w:noHBand="0" w:noVBand="1" w:val="04A0"/>
-      </w:tblPr>
-      <w:tblGrid>
-        <w:gridCol w:w="2665"/>
-        <w:gridCol w:w="2211"/>
-        <w:gridCol w:w="1134"/>
-        <w:gridCol w:w="1304"/>
-        <w:gridCol w:w="2494"/>
-      </w:tblGrid>
-      <w:tr>
-        <w:trPr>
-          <w:tblHeader w:val="true"/>
-        </w:trPr>
-        <w:tc>
-          <w:tcPr>
-            <w:tcW w:type="dxa" w:w="2665"/>
-            <w:vAlign w:val="center"/>
-          </w:tcPr>
-          <w:p>
-            <w:pPr>
-              <w:spacing w:after="40"/>
-            </w:pPr>
-            <w:r>
-              <w:rPr>
-                <w:b/>
-                <w:sz w:val="16"/>
-              </w:rPr>
-              <w:t>Description</w:t>
-            </w:r>
-          </w:p>
-        </w:tc>
-        <w:tc>
-          <w:tcPr>
-            <w:tcW w:type="dxa" w:w="2211"/>
-            <w:vAlign w:val="center"/>
-          </w:tcPr>
-          <w:p>
-            <w:pPr>
-              <w:spacing w:after="40"/>
-            </w:pPr>
-            <w:r>
-              <w:rPr>
-                <w:b/>
-                <w:sz w:val="16"/>
-              </w:rPr>
-              <w:t>Marks and numbers</w:t>
-            </w:r>
-          </w:p>
-        </w:tc>
-        <w:tc>
-          <w:tcPr>
-            <w:tcW w:type="dxa" w:w="1134"/>
-            <w:vAlign w:val="center"/>
-          </w:tcPr>
-          <w:p>
-            <w:pPr>
-              <w:spacing w:after="40"/>
-            </w:pPr>
-            <w:r>
-              <w:rPr>
-                <w:b/>
-                <w:sz w:val="16"/>
-              </w:rPr>
-              <w:t>Packages</w:t>
-            </w:r>
-          </w:p>
-        </w:tc>
-        <w:tc>
-          <w:tcPr>
-            <w:tcW w:type="dxa" w:w="1304"/>
-            <w:vAlign w:val="center"/>
-          </w:tcPr>
-          <w:p>
-            <w:pPr>
-              <w:spacing w:after="40"/>
-            </w:pPr>
-            <w:r>
-              <w:rPr>
-                <w:b/>
-                <w:sz w:val="16"/>
-              </w:rPr>
-              <w:t>Type</w:t>
-            </w:r>
-          </w:p>
-        </w:tc>
-        <w:tc>
-          <w:tcPr>
-            <w:tcW w:type="dxa" w:w="2494"/>
-            <w:vAlign w:val="center"/>
-          </w:tcPr>
-          <w:p>
-            <w:pPr>
-              <w:spacing w:after="40"/>
-            </w:pPr>
-            <w:r>
-              <w:rPr>
-                <w:b/>
-                <w:sz w:val="16"/>
-              </w:rPr>
-              <w:t>Gross weight kg</w:t>
-            </w:r>
-          </w:p>
-        </w:tc>
-      </w:tr>
-      <w:tr>
-        <w:tc>
-          <w:tcPr>
-            <w:tcW w:type="dxa" w:w="2665"/>
-            <w:vAlign w:val="center"/>
-          </w:tcPr>
-          <w:p>
-            <w:pPr>
-              <w:spacing w:after="40"/>
-            </w:pPr>
-            <w:r>
-              <w:rPr>
-                <w:sz w:val="16"/>
-              </w:rPr>
-              <w:t>{$g[i].description}</w:t>
-            </w:r>
-          </w:p>
-        </w:tc>
-        <w:tc>
-          <w:tcPr>
-            <w:tcW w:type="dxa" w:w="2211"/>
-            <w:vAlign w:val="center"/>
-          </w:tcPr>
-          <w:p>
-            <w:pPr>
-              <w:spacing w:after="40"/>
-            </w:pPr>
-            <w:r>
-              <w:rPr>
-                <w:sz w:val="16"/>
+                <w:sz w:val="14"/>
               </w:rPr>
               <w:t>{$marks}</w:t>
             </w:r>
@@ -749,16 +1589,24 @@
         </w:tc>
         <w:tc>
           <w:tcPr>
-            <w:tcW w:type="dxa" w:w="1134"/>
-            <w:vAlign w:val="center"/>
+            <w:tcW w:type="dxa" w:w="1077"/>
+            <w:tcBorders>
+              <w:top w:val="single" w:sz="4" w:color="7E8D97"/>
+              <w:left w:val="single" w:sz="4" w:color="7E8D97"/>
+              <w:bottom w:val="single" w:sz="4" w:color="7E8D97"/>
+              <w:right w:val="single" w:sz="4" w:color="7E8D97"/>
+            </w:tcBorders>
+            <w:tcMar>
+              <w:top w:w="55" w:type="dxa"/>
+              <w:bottom w:w="55" w:type="dxa"/>
+              <w:start w:w="85" w:type="dxa"/>
+              <w:end w:w="85" w:type="dxa"/>
+            </w:tcMar>
           </w:tcPr>
           <w:p>
-            <w:pPr>
-              <w:spacing w:after="40"/>
-            </w:pPr>
             <w:r>
               <w:rPr>
-                <w:sz w:val="16"/>
+                <w:sz w:val="14"/>
               </w:rPr>
               <w:t>{$packages}</w:t>
             </w:r>
@@ -766,16 +1614,24 @@
         </w:tc>
         <w:tc>
           <w:tcPr>
-            <w:tcW w:type="dxa" w:w="1304"/>
-            <w:vAlign w:val="center"/>
+            <w:tcW w:type="dxa" w:w="1701"/>
+            <w:tcBorders>
+              <w:top w:val="single" w:sz="4" w:color="7E8D97"/>
+              <w:left w:val="single" w:sz="4" w:color="7E8D97"/>
+              <w:bottom w:val="single" w:sz="4" w:color="7E8D97"/>
+              <w:right w:val="single" w:sz="4" w:color="7E8D97"/>
+            </w:tcBorders>
+            <w:tcMar>
+              <w:top w:w="55" w:type="dxa"/>
+              <w:bottom w:w="55" w:type="dxa"/>
+              <w:start w:w="85" w:type="dxa"/>
+              <w:end w:w="85" w:type="dxa"/>
+            </w:tcMar>
           </w:tcPr>
           <w:p>
-            <w:pPr>
-              <w:spacing w:after="40"/>
-            </w:pPr>
             <w:r>
               <w:rPr>
-                <w:sz w:val="16"/>
+                <w:sz w:val="14"/>
               </w:rPr>
               <w:t>{$packageType}</w:t>
             </w:r>
@@ -783,16 +1639,24 @@
         </w:tc>
         <w:tc>
           <w:tcPr>
-            <w:tcW w:type="dxa" w:w="2494"/>
-            <w:vAlign w:val="center"/>
+            <w:tcW w:type="dxa" w:w="1814"/>
+            <w:tcBorders>
+              <w:top w:val="single" w:sz="4" w:color="7E8D97"/>
+              <w:left w:val="single" w:sz="4" w:color="7E8D97"/>
+              <w:bottom w:val="single" w:sz="4" w:color="7E8D97"/>
+              <w:right w:val="single" w:sz="4" w:color="7E8D97"/>
+            </w:tcBorders>
+            <w:tcMar>
+              <w:top w:w="55" w:type="dxa"/>
+              <w:bottom w:w="55" w:type="dxa"/>
+              <w:start w:w="85" w:type="dxa"/>
+              <w:end w:w="85" w:type="dxa"/>
+            </w:tcMar>
           </w:tcPr>
           <w:p>
-            <w:pPr>
-              <w:spacing w:after="40"/>
-            </w:pPr>
             <w:r>
               <w:rPr>
-                <w:sz w:val="16"/>
+                <w:sz w:val="14"/>
               </w:rPr>
               <w:t>{$weight}</w:t>
             </w:r>
@@ -802,88 +1666,52 @@
       <w:tr>
         <w:tc>
           <w:tcPr>
-            <w:tcW w:type="dxa" w:w="2665"/>
+            <w:tcW w:type="dxa" w:w="3231"/>
           </w:tcPr>
           <w:p>
-            <w:pPr>
-              <w:spacing w:after="40"/>
-            </w:pPr>
             <w:r>
-              <w:rPr>
-                <w:sz w:val="16"/>
-              </w:rPr>
-              <w:t>{$g[i+1]}</w:t>
+              <w:t>{$goods[i+1]}</w:t>
             </w:r>
           </w:p>
         </w:tc>
         <w:tc>
           <w:tcPr>
-            <w:tcW w:type="dxa" w:w="2211"/>
+            <w:tcW w:type="dxa" w:w="2381"/>
           </w:tcPr>
           <w:p>
-            <w:pPr>
-              <w:spacing w:after="40"/>
-            </w:pPr>
-            <w:r>
-              <w:rPr>
-                <w:sz w:val="16"/>
-              </w:rPr>
-            </w:r>
+            <w:r/>
           </w:p>
         </w:tc>
         <w:tc>
           <w:tcPr>
-            <w:tcW w:type="dxa" w:w="1134"/>
+            <w:tcW w:type="dxa" w:w="1077"/>
           </w:tcPr>
           <w:p>
-            <w:pPr>
-              <w:spacing w:after="40"/>
-            </w:pPr>
-            <w:r>
-              <w:rPr>
-                <w:sz w:val="16"/>
-              </w:rPr>
-            </w:r>
+            <w:r/>
           </w:p>
         </w:tc>
         <w:tc>
           <w:tcPr>
-            <w:tcW w:type="dxa" w:w="1304"/>
+            <w:tcW w:type="dxa" w:w="1701"/>
           </w:tcPr>
           <w:p>
-            <w:pPr>
-              <w:spacing w:after="40"/>
-            </w:pPr>
-            <w:r>
-              <w:rPr>
-                <w:sz w:val="16"/>
-              </w:rPr>
-            </w:r>
+            <w:r/>
           </w:p>
         </w:tc>
         <w:tc>
           <w:tcPr>
-            <w:tcW w:type="dxa" w:w="2494"/>
+            <w:tcW w:type="dxa" w:w="1814"/>
           </w:tcPr>
           <w:p>
-            <w:pPr>
-              <w:spacing w:after="40"/>
-            </w:pPr>
-            <w:r>
-              <w:rPr>
-                <w:sz w:val="16"/>
-              </w:rPr>
-            </w:r>
+            <w:r/>
           </w:p>
         </w:tc>
       </w:tr>
     </w:tbl>
     <w:p>
       <w:pPr>
-        <w:spacing w:after="0"/>
+        <w:spacing w:before="60"/>
       </w:pPr>
-    </w:p>
-    <w:p>
       <w:r>
         <w:rPr>
           <w:b/>
@@ -891,38 +1719,113 @@
         <w:t xml:space="preserve">Special instructions  </w:t>
       </w:r>
       <w:r>
-        <w:t>{d.bookingConfirmation.specialInstructions}</w:t>
+        <w:t>{$instructions}</w:t>
       </w:r>
     </w:p>
     <w:p>
       <w:pPr>
-        <w:pStyle w:val="Heading1"/>
+        <w:spacing w:before="40"/>
       </w:pPr>
       <w:r>
-        <w:t>Customer selling charges</w:t>
+        <w:t>Prepared by {$preparedBy}</w:t>
+      </w:r>
+    </w:p>
+    <w:p>
+      <w:pPr>
+        <w:spacing w:before="120" w:after="40"/>
+      </w:pPr>
+      <w:r>
+        <w:rPr>
+          <w:b/>
+          <w:color w:val="264860"/>
+          <w:sz w:val="14"/>
+        </w:rPr>
+        <w:t>CUSTOMER SELLING CHARGES</w:t>
+      </w:r>
+    </w:p>
+    <w:p>
+      <w:pPr>
+        <w:spacing w:line="24" w:lineRule="auto"/>
+      </w:pPr>
+      <w:r>
+        <w:rPr>
+          <w:sz w:val="2"/>
+        </w:rPr>
+        <w:t>{d.bookingConfirmation.priceStatus:ifNE('confirmed'):showBegin}</w:t>
       </w:r>
     </w:p>
     <w:p>
       <w:r>
-        <w:t>{d.bookingConfirmation.priceStatus:ifNE('confirmed'):show('Price to be confirmed'):elseShow('')}</w:t>
+        <w:t>Price to be confirmed</w:t>
       </w:r>
     </w:p>
     <w:p>
+      <w:pPr>
+        <w:spacing w:line="24" w:lineRule="auto"/>
+      </w:pPr>
       <w:r>
+        <w:rPr>
+          <w:sz w:val="2"/>
+        </w:rPr>
+        <w:t>{d.bookingConfirmation.priceStatus:showEnd}</w:t>
+      </w:r>
+    </w:p>
+    <w:p>
+      <w:pPr>
+        <w:spacing w:line="24" w:lineRule="auto"/>
+      </w:pPr>
+      <w:r>
+        <w:rPr>
+          <w:sz w:val="2"/>
+        </w:rPr>
         <w:t>{d.bookingConfirmation.priceStatus:ifEQ('confirmed'):showBegin}</w:t>
+      </w:r>
+    </w:p>
+    <w:p>
+      <w:pPr>
+        <w:spacing w:line="24" w:lineRule="auto"/>
+      </w:pPr>
+      <w:r>
+        <w:rPr>
+          <w:sz w:val="2"/>
+        </w:rPr>
+        <w:t>{#charges=d.bookingConfirmation.chargeLines}</w:t>
+      </w:r>
+      <w:r>
+        <w:rPr>
+          <w:sz w:val="2"/>
+        </w:rPr>
+        <w:t>{#chargeCurrency=d.bookingConfirmation.chargeLines[i].currency}</w:t>
+      </w:r>
+      <w:r>
+        <w:rPr>
+          <w:sz w:val="2"/>
+        </w:rPr>
+        <w:t>{#chargeAmount=d.bookingConfirmation.chargeLines[i].sellAmount:formatN(2)}</w:t>
+      </w:r>
+      <w:r>
+        <w:rPr>
+          <w:sz w:val="2"/>
+        </w:rPr>
+        <w:t>{#totals=d.bookingConfirmation.chargeTotals}</w:t>
+      </w:r>
+      <w:r>
+        <w:rPr>
+          <w:sz w:val="2"/>
+        </w:rPr>
+        <w:t>{#totalAmount=d.bookingConfirmation.chargeTotals[i].amount:formatN(2)}</w:t>
       </w:r>
     </w:p>
     <w:tbl>
       <w:tblPr>
-        <w:tblStyle w:val="TableGrid"/>
         <w:tblW w:type="auto" w:w="0"/>
         <w:tblLayout w:type="fixed"/>
         <w:tblLook w:firstColumn="1" w:firstRow="1" w:lastColumn="0" w:lastRow="0" w:noHBand="0" w:noVBand="1" w:val="04A0"/>
       </w:tblPr>
       <w:tblGrid>
-        <w:gridCol w:w="5669"/>
-        <w:gridCol w:w="1701"/>
-        <w:gridCol w:w="2438"/>
+        <w:gridCol w:w="6576"/>
+        <w:gridCol w:w="1587"/>
+        <w:gridCol w:w="2041"/>
       </w:tblGrid>
       <w:tr>
         <w:trPr>
@@ -930,55 +1833,165 @@
         </w:trPr>
         <w:tc>
           <w:tcPr>
-            <w:tcW w:type="dxa" w:w="5669"/>
+            <w:tcW w:type="dxa" w:w="6576"/>
             <w:vAlign w:val="center"/>
+            <w:tcBorders>
+              <w:top w:val="single" w:sz="4" w:color="7E8D97"/>
+              <w:left w:val="single" w:sz="4" w:color="7E8D97"/>
+              <w:bottom w:val="single" w:sz="4" w:color="7E8D97"/>
+              <w:right w:val="single" w:sz="4" w:color="7E8D97"/>
+            </w:tcBorders>
+            <w:tcMar>
+              <w:top w:w="55" w:type="dxa"/>
+              <w:bottom w:w="55" w:type="dxa"/>
+              <w:start w:w="85" w:type="dxa"/>
+              <w:end w:w="85" w:type="dxa"/>
+            </w:tcMar>
           </w:tcPr>
           <w:p>
-            <w:pPr>
-              <w:spacing w:after="40"/>
-            </w:pPr>
             <w:r>
               <w:rPr>
                 <w:b/>
-                <w:sz w:val="16"/>
+                <w:color w:val="264860"/>
+                <w:sz w:val="12"/>
               </w:rPr>
-              <w:t>Charge</w:t>
+              <w:t>SERVICE</w:t>
             </w:r>
           </w:p>
         </w:tc>
         <w:tc>
           <w:tcPr>
-            <w:tcW w:type="dxa" w:w="1701"/>
+            <w:tcW w:type="dxa" w:w="1587"/>
             <w:vAlign w:val="center"/>
+            <w:tcBorders>
+              <w:top w:val="single" w:sz="4" w:color="7E8D97"/>
+              <w:left w:val="single" w:sz="4" w:color="7E8D97"/>
+              <w:bottom w:val="single" w:sz="4" w:color="7E8D97"/>
+              <w:right w:val="single" w:sz="4" w:color="7E8D97"/>
+            </w:tcBorders>
+            <w:tcMar>
+              <w:top w:w="55" w:type="dxa"/>
+              <w:bottom w:w="55" w:type="dxa"/>
+              <w:start w:w="85" w:type="dxa"/>
+              <w:end w:w="85" w:type="dxa"/>
+            </w:tcMar>
           </w:tcPr>
           <w:p>
-            <w:pPr>
-              <w:spacing w:after="40"/>
-            </w:pPr>
             <w:r>
               <w:rPr>
                 <w:b/>
-                <w:sz w:val="16"/>
+                <w:color w:val="264860"/>
+                <w:sz w:val="12"/>
               </w:rPr>
-              <w:t>Currency</w:t>
+              <w:t>CURRENCY</w:t>
             </w:r>
           </w:p>
         </w:tc>
         <w:tc>
           <w:tcPr>
-            <w:tcW w:type="dxa" w:w="2438"/>
+            <w:tcW w:type="dxa" w:w="2041"/>
             <w:vAlign w:val="center"/>
+            <w:tcBorders>
+              <w:top w:val="single" w:sz="4" w:color="7E8D97"/>
+              <w:left w:val="single" w:sz="4" w:color="7E8D97"/>
+              <w:bottom w:val="single" w:sz="4" w:color="7E8D97"/>
+              <w:right w:val="single" w:sz="4" w:color="7E8D97"/>
+            </w:tcBorders>
+            <w:tcMar>
+              <w:top w:w="55" w:type="dxa"/>
+              <w:bottom w:w="55" w:type="dxa"/>
+              <w:start w:w="85" w:type="dxa"/>
+              <w:end w:w="85" w:type="dxa"/>
+            </w:tcMar>
           </w:tcPr>
           <w:p>
-            <w:pPr>
-              <w:spacing w:after="40"/>
-            </w:pPr>
             <w:r>
               <w:rPr>
                 <w:b/>
-                <w:sz w:val="16"/>
+                <w:color w:val="264860"/>
+                <w:sz w:val="12"/>
               </w:rPr>
-              <w:t>Selling price</w:t>
+              <w:t>SELLING PRICE</w:t>
+            </w:r>
+          </w:p>
+        </w:tc>
+      </w:tr>
+      <w:tr>
+        <w:trPr>
+          <w:cantSplit/>
+        </w:trPr>
+        <w:tc>
+          <w:tcPr>
+            <w:tcW w:type="dxa" w:w="6576"/>
+            <w:tcBorders>
+              <w:top w:val="single" w:sz="4" w:color="7E8D97"/>
+              <w:left w:val="single" w:sz="4" w:color="7E8D97"/>
+              <w:bottom w:val="single" w:sz="4" w:color="7E8D97"/>
+              <w:right w:val="single" w:sz="4" w:color="7E8D97"/>
+            </w:tcBorders>
+            <w:tcMar>
+              <w:top w:w="55" w:type="dxa"/>
+              <w:bottom w:w="55" w:type="dxa"/>
+              <w:start w:w="85" w:type="dxa"/>
+              <w:end w:w="85" w:type="dxa"/>
+            </w:tcMar>
+          </w:tcPr>
+          <w:p>
+            <w:r>
+              <w:rPr>
+                <w:sz w:val="14"/>
+              </w:rPr>
+              <w:t>{$charges[i].description}</w:t>
+            </w:r>
+          </w:p>
+        </w:tc>
+        <w:tc>
+          <w:tcPr>
+            <w:tcW w:type="dxa" w:w="1587"/>
+            <w:tcBorders>
+              <w:top w:val="single" w:sz="4" w:color="7E8D97"/>
+              <w:left w:val="single" w:sz="4" w:color="7E8D97"/>
+              <w:bottom w:val="single" w:sz="4" w:color="7E8D97"/>
+              <w:right w:val="single" w:sz="4" w:color="7E8D97"/>
+            </w:tcBorders>
+            <w:tcMar>
+              <w:top w:w="55" w:type="dxa"/>
+              <w:bottom w:w="55" w:type="dxa"/>
+              <w:start w:w="85" w:type="dxa"/>
+              <w:end w:w="85" w:type="dxa"/>
+            </w:tcMar>
+          </w:tcPr>
+          <w:p>
+            <w:r>
+              <w:rPr>
+                <w:sz w:val="14"/>
+              </w:rPr>
+              <w:t>{$chargeCurrency}</w:t>
+            </w:r>
+          </w:p>
+        </w:tc>
+        <w:tc>
+          <w:tcPr>
+            <w:tcW w:type="dxa" w:w="2041"/>
+            <w:tcBorders>
+              <w:top w:val="single" w:sz="4" w:color="7E8D97"/>
+              <w:left w:val="single" w:sz="4" w:color="7E8D97"/>
+              <w:bottom w:val="single" w:sz="4" w:color="7E8D97"/>
+              <w:right w:val="single" w:sz="4" w:color="7E8D97"/>
+            </w:tcBorders>
+            <w:tcMar>
+              <w:top w:w="55" w:type="dxa"/>
+              <w:bottom w:w="55" w:type="dxa"/>
+              <w:start w:w="85" w:type="dxa"/>
+              <w:end w:w="85" w:type="dxa"/>
+            </w:tcMar>
+          </w:tcPr>
+          <w:p>
+            <w:r>
+              <w:rPr>
+                <w:sz w:val="14"/>
+              </w:rPr>
+              <w:t>{$chargeAmount}</w:t>
             </w:r>
           </w:p>
         </w:tc>
@@ -986,52 +1999,154 @@
       <w:tr>
         <w:tc>
           <w:tcPr>
-            <w:tcW w:type="dxa" w:w="5669"/>
-            <w:vAlign w:val="center"/>
+            <w:tcW w:type="dxa" w:w="6576"/>
           </w:tcPr>
           <w:p>
-            <w:pPr>
-              <w:spacing w:after="40"/>
-            </w:pPr>
             <w:r>
-              <w:rPr>
-                <w:sz w:val="16"/>
-              </w:rPr>
-              <w:t>{d.bookingConfirmation.chargeLines[i].description}</w:t>
+              <w:t>{$charges[i+1]}</w:t>
             </w:r>
           </w:p>
         </w:tc>
         <w:tc>
           <w:tcPr>
-            <w:tcW w:type="dxa" w:w="1701"/>
-            <w:vAlign w:val="center"/>
+            <w:tcW w:type="dxa" w:w="1587"/>
           </w:tcPr>
           <w:p>
-            <w:pPr>
-              <w:spacing w:after="40"/>
-            </w:pPr>
+            <w:r/>
+          </w:p>
+        </w:tc>
+        <w:tc>
+          <w:tcPr>
+            <w:tcW w:type="dxa" w:w="2041"/>
+          </w:tcPr>
+          <w:p>
+            <w:r/>
+          </w:p>
+        </w:tc>
+      </w:tr>
+    </w:tbl>
+    <w:tbl>
+      <w:tblPr>
+        <w:tblW w:type="auto" w:w="0"/>
+        <w:tblLayout w:type="fixed"/>
+        <w:tblLook w:firstColumn="1" w:firstRow="1" w:lastColumn="0" w:lastRow="0" w:noHBand="0" w:noVBand="1" w:val="04A0"/>
+      </w:tblPr>
+      <w:tblGrid>
+        <w:gridCol w:w="5102"/>
+        <w:gridCol w:w="5102"/>
+      </w:tblGrid>
+      <w:tr>
+        <w:trPr>
+          <w:tblHeader w:val="true"/>
+        </w:trPr>
+        <w:tc>
+          <w:tcPr>
+            <w:tcW w:type="dxa" w:w="5102"/>
+            <w:vAlign w:val="center"/>
+            <w:tcBorders>
+              <w:top w:val="single" w:sz="4" w:color="7E8D97"/>
+              <w:left w:val="single" w:sz="4" w:color="7E8D97"/>
+              <w:bottom w:val="single" w:sz="4" w:color="7E8D97"/>
+              <w:right w:val="single" w:sz="4" w:color="7E8D97"/>
+            </w:tcBorders>
+            <w:tcMar>
+              <w:top w:w="55" w:type="dxa"/>
+              <w:bottom w:w="55" w:type="dxa"/>
+              <w:start w:w="85" w:type="dxa"/>
+              <w:end w:w="85" w:type="dxa"/>
+            </w:tcMar>
+          </w:tcPr>
+          <w:p>
             <w:r>
               <w:rPr>
-                <w:sz w:val="16"/>
+                <w:b/>
+                <w:color w:val="264860"/>
+                <w:sz w:val="12"/>
               </w:rPr>
-              <w:t>{d.bookingConfirmation.chargeLines[i].currency}</w:t>
+              <w:t>TOTAL CURRENCY</w:t>
             </w:r>
           </w:p>
         </w:tc>
         <w:tc>
           <w:tcPr>
-            <w:tcW w:type="dxa" w:w="2438"/>
+            <w:tcW w:type="dxa" w:w="5102"/>
             <w:vAlign w:val="center"/>
+            <w:tcBorders>
+              <w:top w:val="single" w:sz="4" w:color="7E8D97"/>
+              <w:left w:val="single" w:sz="4" w:color="7E8D97"/>
+              <w:bottom w:val="single" w:sz="4" w:color="7E8D97"/>
+              <w:right w:val="single" w:sz="4" w:color="7E8D97"/>
+            </w:tcBorders>
+            <w:tcMar>
+              <w:top w:w="55" w:type="dxa"/>
+              <w:bottom w:w="55" w:type="dxa"/>
+              <w:start w:w="85" w:type="dxa"/>
+              <w:end w:w="85" w:type="dxa"/>
+            </w:tcMar>
           </w:tcPr>
           <w:p>
-            <w:pPr>
-              <w:spacing w:after="40"/>
-            </w:pPr>
             <w:r>
               <w:rPr>
-                <w:sz w:val="16"/>
+                <w:b/>
+                <w:color w:val="264860"/>
+                <w:sz w:val="12"/>
               </w:rPr>
-              <w:t>{d.bookingConfirmation.chargeLines[i].sellAmount:formatN(2)}</w:t>
+              <w:t>CUSTOMER TOTAL</w:t>
+            </w:r>
+          </w:p>
+        </w:tc>
+      </w:tr>
+      <w:tr>
+        <w:trPr>
+          <w:cantSplit/>
+        </w:trPr>
+        <w:tc>
+          <w:tcPr>
+            <w:tcW w:type="dxa" w:w="5102"/>
+            <w:tcBorders>
+              <w:top w:val="single" w:sz="4" w:color="7E8D97"/>
+              <w:left w:val="single" w:sz="4" w:color="7E8D97"/>
+              <w:bottom w:val="single" w:sz="4" w:color="7E8D97"/>
+              <w:right w:val="single" w:sz="4" w:color="7E8D97"/>
+            </w:tcBorders>
+            <w:tcMar>
+              <w:top w:w="55" w:type="dxa"/>
+              <w:bottom w:w="55" w:type="dxa"/>
+              <w:start w:w="85" w:type="dxa"/>
+              <w:end w:w="85" w:type="dxa"/>
+            </w:tcMar>
+          </w:tcPr>
+          <w:p>
+            <w:r>
+              <w:rPr>
+                <w:sz w:val="14"/>
+              </w:rPr>
+              <w:t>{$totals[i].currency}</w:t>
+            </w:r>
+          </w:p>
+        </w:tc>
+        <w:tc>
+          <w:tcPr>
+            <w:tcW w:type="dxa" w:w="5102"/>
+            <w:tcBorders>
+              <w:top w:val="single" w:sz="4" w:color="7E8D97"/>
+              <w:left w:val="single" w:sz="4" w:color="7E8D97"/>
+              <w:bottom w:val="single" w:sz="4" w:color="7E8D97"/>
+              <w:right w:val="single" w:sz="4" w:color="7E8D97"/>
+            </w:tcBorders>
+            <w:tcMar>
+              <w:top w:w="55" w:type="dxa"/>
+              <w:bottom w:w="55" w:type="dxa"/>
+              <w:start w:w="85" w:type="dxa"/>
+              <w:end w:w="85" w:type="dxa"/>
+            </w:tcMar>
+          </w:tcPr>
+          <w:p>
+            <w:r>
+              <w:rPr>
+                <w:sz w:val="14"/>
+              </w:rPr>
+              <w:t>{$totalAmount}</w:t>
             </w:r>
           </w:p>
         </w:tc>
@@ -1039,193 +2154,39 @@
       <w:tr>
         <w:tc>
           <w:tcPr>
-            <w:tcW w:type="dxa" w:w="5669"/>
+            <w:tcW w:type="dxa" w:w="5102"/>
           </w:tcPr>
           <w:p>
-            <w:pPr>
-              <w:spacing w:after="40"/>
-            </w:pPr>
             <w:r>
-              <w:rPr>
-                <w:sz w:val="16"/>
-              </w:rPr>
-              <w:t>{d.bookingConfirmation.chargeLines[i+1]}</w:t>
+              <w:t>{$totals[i+1]}</w:t>
             </w:r>
           </w:p>
         </w:tc>
         <w:tc>
           <w:tcPr>
-            <w:tcW w:type="dxa" w:w="1701"/>
+            <w:tcW w:type="dxa" w:w="5102"/>
           </w:tcPr>
           <w:p>
-            <w:pPr>
-              <w:spacing w:after="40"/>
-            </w:pPr>
-            <w:r>
-              <w:rPr>
-                <w:sz w:val="16"/>
-              </w:rPr>
-            </w:r>
-          </w:p>
-        </w:tc>
-        <w:tc>
-          <w:tcPr>
-            <w:tcW w:type="dxa" w:w="2438"/>
-          </w:tcPr>
-          <w:p>
-            <w:pPr>
-              <w:spacing w:after="40"/>
-            </w:pPr>
-            <w:r>
-              <w:rPr>
-                <w:sz w:val="16"/>
-              </w:rPr>
-            </w:r>
+            <w:r/>
           </w:p>
         </w:tc>
       </w:tr>
     </w:tbl>
     <w:p>
       <w:pPr>
-        <w:spacing w:after="0"/>
+        <w:spacing w:line="24" w:lineRule="auto"/>
       </w:pPr>
-    </w:p>
-    <w:tbl>
-      <w:tblPr>
-        <w:tblStyle w:val="TableGrid"/>
-        <w:tblW w:type="auto" w:w="0"/>
-        <w:tblLayout w:type="fixed"/>
-        <w:tblLook w:firstColumn="1" w:firstRow="1" w:lastColumn="0" w:lastRow="0" w:noHBand="0" w:noVBand="1" w:val="04A0"/>
-      </w:tblPr>
-      <w:tblGrid>
-        <w:gridCol w:w="4932"/>
-        <w:gridCol w:w="4876"/>
-      </w:tblGrid>
-      <w:tr>
-        <w:trPr>
-          <w:tblHeader w:val="true"/>
-        </w:trPr>
-        <w:tc>
-          <w:tcPr>
-            <w:tcW w:type="dxa" w:w="4932"/>
-            <w:vAlign w:val="center"/>
-          </w:tcPr>
-          <w:p>
-            <w:pPr>
-              <w:spacing w:after="40"/>
-            </w:pPr>
-            <w:r>
-              <w:rPr>
-                <w:b/>
-                <w:sz w:val="16"/>
-              </w:rPr>
-              <w:t>Total currency</w:t>
-            </w:r>
-          </w:p>
-        </w:tc>
-        <w:tc>
-          <w:tcPr>
-            <w:tcW w:type="dxa" w:w="4876"/>
-            <w:vAlign w:val="center"/>
-          </w:tcPr>
-          <w:p>
-            <w:pPr>
-              <w:spacing w:after="40"/>
-            </w:pPr>
-            <w:r>
-              <w:rPr>
-                <w:b/>
-                <w:sz w:val="16"/>
-              </w:rPr>
-              <w:t>Customer total</w:t>
-            </w:r>
-          </w:p>
-        </w:tc>
-      </w:tr>
-      <w:tr>
-        <w:tc>
-          <w:tcPr>
-            <w:tcW w:type="dxa" w:w="4932"/>
-            <w:vAlign w:val="center"/>
-          </w:tcPr>
-          <w:p>
-            <w:pPr>
-              <w:spacing w:after="40"/>
-            </w:pPr>
-            <w:r>
-              <w:rPr>
-                <w:sz w:val="16"/>
-              </w:rPr>
-              <w:t>{d.bookingConfirmation.chargeTotals[i].currency}</w:t>
-            </w:r>
-          </w:p>
-        </w:tc>
-        <w:tc>
-          <w:tcPr>
-            <w:tcW w:type="dxa" w:w="4876"/>
-            <w:vAlign w:val="center"/>
-          </w:tcPr>
-          <w:p>
-            <w:pPr>
-              <w:spacing w:after="40"/>
-            </w:pPr>
-            <w:r>
-              <w:rPr>
-                <w:sz w:val="16"/>
-              </w:rPr>
-              <w:t>{d.bookingConfirmation.chargeTotals[i].amount:formatN(2)}</w:t>
-            </w:r>
-          </w:p>
-        </w:tc>
-      </w:tr>
-      <w:tr>
-        <w:tc>
-          <w:tcPr>
-            <w:tcW w:type="dxa" w:w="4932"/>
-          </w:tcPr>
-          <w:p>
-            <w:pPr>
-              <w:spacing w:after="40"/>
-            </w:pPr>
-            <w:r>
-              <w:rPr>
-                <w:sz w:val="16"/>
-              </w:rPr>
-              <w:t>{d.bookingConfirmation.chargeTotals[i+1]}</w:t>
-            </w:r>
-          </w:p>
-        </w:tc>
-        <w:tc>
-          <w:tcPr>
-            <w:tcW w:type="dxa" w:w="4876"/>
-          </w:tcPr>
-          <w:p>
-            <w:pPr>
-              <w:spacing w:after="40"/>
-            </w:pPr>
-            <w:r>
-              <w:rPr>
-                <w:sz w:val="16"/>
-              </w:rPr>
-            </w:r>
-          </w:p>
-        </w:tc>
-      </w:tr>
-    </w:tbl>
-    <w:p>
-      <w:pPr>
-        <w:spacing w:after="0"/>
-      </w:pPr>
-    </w:p>
-    <w:p>
       <w:r>
+        <w:rPr>
+          <w:sz w:val="2"/>
+        </w:rPr>
         <w:t>{d.bookingConfirmation.priceStatus:showEnd}</w:t>
       </w:r>
     </w:p>
     <w:sectPr>
       <w:footerReference w:type="default" r:id="rId9"/>
       <w:pgSz w:w="11906" w:h="16838"/>
-      <w:pgMar w:top="1037" w:right="1037" w:bottom="1037" w:left="1037" w:header="720" w:footer="720" w:gutter="0"/>
+      <w:pgMar w:top="680" w:right="850" w:bottom="737" w:left="850" w:header="720" w:footer="340" w:gutter="0"/>
       <w:cols w:space="720"/>
       <w:docGrid w:linePitch="360"/>
     </w:sectPr>
@@ -1241,7 +2202,11 @@
       <w:jc w:val="center"/>
     </w:pPr>
     <w:r>
-      <w:t>Booking confirmation · {d.bookingConfirmation.bookingReference}</w:t>
+      <w:rPr>
+        <w:color w:val="264860"/>
+        <w:sz w:val="13"/>
+      </w:rPr>
+      <w:t>Jenkar Shipping Limited  ·  Booking {$ref}</w:t>
     </w:r>
   </w:p>
 </w:ftr>
@@ -1611,12 +2576,12 @@
     <w:qFormat/>
     <w:rsid w:val="00FC693F"/>
     <w:pPr>
-      <w:spacing w:after="120"/>
+      <w:spacing w:after="0" w:line="247" w:lineRule="auto"/>
     </w:pPr>
     <w:rPr>
-      <w:rFonts w:ascii="Aptos" w:hAnsi="Aptos"/>
-      <w:color w:val="292929"/>
-      <w:sz w:val="19"/>
+      <w:rFonts w:ascii="Arial" w:hAnsi="Arial"/>
+      <w:color w:val="232E36"/>
+      <w:sz w:val="16"/>
     </w:rPr>
   </w:style>
   <w:style w:type="paragraph" w:styleId="Header">
@@ -1674,15 +2639,15 @@
     <w:pPr>
       <w:keepNext/>
       <w:keepLines/>
-      <w:spacing w:before="240" w:after="100"/>
+      <w:spacing w:before="480" w:after="0"/>
       <w:outlineLvl w:val="0"/>
     </w:pPr>
     <w:rPr>
-      <w:rFonts w:asciiTheme="majorHAnsi" w:eastAsiaTheme="majorEastAsia" w:hAnsiTheme="majorHAnsi" w:cstheme="majorBidi" w:ascii="Aptos" w:hAnsi="Aptos"/>
+      <w:rFonts w:asciiTheme="majorHAnsi" w:eastAsiaTheme="majorEastAsia" w:hAnsiTheme="majorHAnsi" w:cstheme="majorBidi"/>
       <w:b/>
       <w:bCs/>
-      <w:color w:val="000000"/>
-      <w:sz w:val="22"/>
+      <w:color w:val="365F91" w:themeColor="accent1" w:themeShade="BF"/>
+      <w:sz w:val="28"/>
       <w:szCs w:val="28"/>
     </w:rPr>
   </w:style>
@@ -1960,16 +2925,18 @@
     <w:qFormat/>
     <w:rsid w:val="00FC693F"/>
     <w:pPr>
-      <w:spacing w:after="100" w:line="240" w:lineRule="auto" w:before="0"/>
+      <w:pBdr>
+        <w:bottom w:val="single" w:sz="8" w:space="4" w:color="4F81BD" w:themeColor="accent1"/>
+      </w:pBdr>
+      <w:spacing w:after="300" w:line="240" w:lineRule="auto"/>
       <w:contextualSpacing/>
     </w:pPr>
     <w:rPr>
-      <w:rFonts w:asciiTheme="majorHAnsi" w:eastAsiaTheme="majorEastAsia" w:hAnsiTheme="majorHAnsi" w:cstheme="majorBidi" w:ascii="Aptos" w:hAnsi="Aptos"/>
-      <w:b/>
-      <w:color w:val="000000"/>
+      <w:rFonts w:asciiTheme="majorHAnsi" w:eastAsiaTheme="majorEastAsia" w:hAnsiTheme="majorHAnsi" w:cstheme="majorBidi"/>
+      <w:color w:val="17365D" w:themeColor="text2" w:themeShade="BF"/>
       <w:spacing w:val="5"/>
       <w:kern w:val="28"/>
-      <w:sz w:val="36"/>
+      <w:sz w:val="52"/>
       <w:szCs w:val="52"/>
     </w:rPr>
   </w:style>

</xml_diff>